<commit_message>
Inserção dos exercícios de lista
</commit_message>
<xml_diff>
--- a/Arrays-Exercícios.docx
+++ b/Arrays-Exercícios.docx
@@ -2,6 +2,38 @@
 <file path=word/document.xml><?xml version="1.0" encoding="utf-8"?>
 <w:document xmlns:wpc="http://schemas.microsoft.com/office/word/2010/wordprocessingCanvas" xmlns:cx="http://schemas.microsoft.com/office/drawing/2014/chartex" xmlns:cx1="http://schemas.microsoft.com/office/drawing/2015/9/8/chartex" xmlns:cx2="http://schemas.microsoft.com/office/drawing/2015/10/21/chartex" xmlns:cx3="http://schemas.microsoft.com/office/drawing/2016/5/9/chartex" xmlns:cx4="http://schemas.microsoft.com/office/drawing/2016/5/10/chartex" xmlns:cx5="http://schemas.microsoft.com/office/drawing/2016/5/11/chartex" xmlns:cx6="http://schemas.microsoft.com/office/drawing/2016/5/12/chartex" xmlns:cx7="http://schemas.microsoft.com/office/drawing/2016/5/13/chartex" xmlns:cx8="http://schemas.microsoft.com/office/drawing/2016/5/14/chartex" xmlns:mc="http://schemas.openxmlformats.org/markup-compatibility/2006" xmlns:aink="http://schemas.microsoft.com/office/drawing/2016/ink" xmlns:am3d="http://schemas.microsoft.com/office/drawing/2017/model3d" xmlns:o="urn:schemas-microsoft-com:office:office" xmlns:oel="http://schemas.microsoft.com/office/2019/extlst" xmlns:r="http://schemas.openxmlformats.org/officeDocument/2006/relationships" xmlns:m="http://schemas.openxmlformats.org/officeDocument/2006/math" xmlns:v="urn:schemas-microsoft-com:vml" xmlns:wp14="http://schemas.microsoft.com/office/word/2010/wordprocessingDrawing" xmlns:wp="http://schemas.openxmlformats.org/drawingml/2006/wordprocessingDrawing" xmlns:w10="urn:schemas-microsoft-com:office:word" xmlns:w="http://schemas.openxmlformats.org/wordprocessingml/2006/main" xmlns:w14="http://schemas.microsoft.com/office/word/2010/wordml" xmlns:w15="http://schemas.microsoft.com/office/word/2012/wordml" xmlns:w16cex="http://schemas.microsoft.com/office/word/2018/wordml/cex" xmlns:w16cid="http://schemas.microsoft.com/office/word/2016/wordml/cid" xmlns:w16="http://schemas.microsoft.com/office/word/2018/wordml" xmlns:w16du="http://schemas.microsoft.com/office/word/2023/wordml/word16du" xmlns:w16sdtdh="http://schemas.microsoft.com/office/word/2020/wordml/sdtdatahash" xmlns:w16sdtfl="http://schemas.microsoft.com/office/word/2024/wordml/sdtformatlock" xmlns:w16se="http://schemas.microsoft.com/office/word/2015/wordml/symex" xmlns:wpg="http://schemas.microsoft.com/office/word/2010/wordprocessingGroup" xmlns:wpi="http://schemas.microsoft.com/office/word/2010/wordprocessingInk" xmlns:wne="http://schemas.microsoft.com/office/word/2006/wordml" xmlns:wps="http://schemas.microsoft.com/office/word/2010/wordprocessingShape" mc:Ignorable="w14 w15 w16se w16cid w16 w16cex w16sdtdh w16sdtfl w16du wp14">
   <w:body>
+    <w:p>
+      <w:pPr>
+        <w:jc w:val="center"/>
+        <w:rPr>
+          <w:b/>
+          <w:bCs/>
+          <w:sz w:val="40"/>
+          <w:szCs w:val="40"/>
+        </w:rPr>
+      </w:pPr>
+      <w:proofErr w:type="spellStart"/>
+      <w:r>
+        <w:rPr>
+          <w:b/>
+          <w:bCs/>
+          <w:sz w:val="40"/>
+          <w:szCs w:val="40"/>
+        </w:rPr>
+        <w:t>Arrays</w:t>
+      </w:r>
+      <w:proofErr w:type="spellEnd"/>
+    </w:p>
+    <w:p>
+      <w:pPr>
+        <w:rPr>
+          <w:b/>
+          <w:bCs/>
+          <w:sz w:val="32"/>
+          <w:szCs w:val="32"/>
+        </w:rPr>
+      </w:pPr>
+    </w:p>
     <w:p>
       <w:pPr>
         <w:rPr>
@@ -506,7 +538,6 @@
         <w:rPr>
           <w:color w:val="000000" w:themeColor="text1"/>
         </w:rPr>
-        <w:lastRenderedPageBreak/>
         <w:t>class</w:t>
       </w:r>
       <w:proofErr w:type="spellEnd"/>
@@ -1286,6 +1317,7 @@
         <w:rPr>
           <w:color w:val="EE0000"/>
         </w:rPr>
+        <w:lastRenderedPageBreak/>
         <w:t>None</w:t>
       </w:r>
       <w:proofErr w:type="spellEnd"/>
@@ -1390,7 +1422,6 @@
           <w:sz w:val="32"/>
           <w:szCs w:val="32"/>
         </w:rPr>
-        <w:lastRenderedPageBreak/>
         <w:t>Exercício</w:t>
       </w:r>
       <w:r>
@@ -1917,6 +1948,7 @@
         <w:rPr>
           <w:color w:val="EE0000"/>
         </w:rPr>
+        <w:lastRenderedPageBreak/>
         <w:t>print(</w:t>
       </w:r>
       <w:proofErr w:type="gramEnd"/>
@@ -2236,22 +2268,3955 @@
     </w:p>
     <w:p>
       <w:pPr>
-        <w:rPr>
-          <w:color w:val="EE0000"/>
-        </w:rPr>
-      </w:pPr>
-    </w:p>
-    <w:p>
-      <w:pPr>
-        <w:rPr>
-          <w:color w:val="EE0000"/>
-        </w:rPr>
-      </w:pPr>
-    </w:p>
-    <w:p>
-      <w:pPr>
-        <w:rPr>
-          <w:color w:val="EE0000"/>
+        <w:jc w:val="center"/>
+        <w:rPr>
+          <w:b/>
+          <w:bCs/>
+          <w:sz w:val="40"/>
+          <w:szCs w:val="40"/>
+        </w:rPr>
+      </w:pPr>
+      <w:r>
+        <w:rPr>
+          <w:b/>
+          <w:bCs/>
+          <w:sz w:val="40"/>
+          <w:szCs w:val="40"/>
+        </w:rPr>
+        <w:t>Listas Encadeadas</w:t>
+      </w:r>
+    </w:p>
+    <w:p>
+      <w:pPr>
+        <w:rPr>
+          <w:color w:val="EE0000"/>
+        </w:rPr>
+      </w:pPr>
+    </w:p>
+    <w:p>
+      <w:pPr>
+        <w:rPr>
+          <w:b/>
+          <w:bCs/>
+          <w:sz w:val="32"/>
+          <w:szCs w:val="32"/>
+        </w:rPr>
+      </w:pPr>
+      <w:r>
+        <w:rPr>
+          <w:b/>
+          <w:bCs/>
+          <w:sz w:val="32"/>
+          <w:szCs w:val="32"/>
+        </w:rPr>
+        <w:t>Exercício 1: Inserção ordenada em lista encadeada</w:t>
+      </w:r>
+    </w:p>
+    <w:p>
+      <w:r>
+        <w:rPr>
+          <w:b/>
+          <w:bCs/>
+        </w:rPr>
+        <w:t>Objetivo:</w:t>
+      </w:r>
+      <w:r>
+        <w:t xml:space="preserve"> Criar uma lista encadeada que mantém os elementos sempre em ordem crescente no momento da inserção.</w:t>
+      </w:r>
+    </w:p>
+    <w:p>
+      <w:r>
+        <w:t>Requisitos:</w:t>
+      </w:r>
+    </w:p>
+    <w:p>
+      <w:pPr>
+        <w:numPr>
+          <w:ilvl w:val="0"/>
+          <w:numId w:val="6"/>
+        </w:numPr>
+      </w:pPr>
+      <w:r>
+        <w:t xml:space="preserve">Implemente uma </w:t>
+      </w:r>
+      <w:proofErr w:type="gramStart"/>
+      <w:r>
+        <w:t>classe Node</w:t>
+      </w:r>
+      <w:proofErr w:type="gramEnd"/>
+      <w:r>
+        <w:t xml:space="preserve"> e uma classe </w:t>
+      </w:r>
+      <w:proofErr w:type="spellStart"/>
+      <w:r>
+        <w:t>LinkedList</w:t>
+      </w:r>
+      <w:proofErr w:type="spellEnd"/>
+      <w:r>
+        <w:t>.</w:t>
+      </w:r>
+    </w:p>
+    <w:p>
+      <w:pPr>
+        <w:numPr>
+          <w:ilvl w:val="0"/>
+          <w:numId w:val="6"/>
+        </w:numPr>
+      </w:pPr>
+      <w:r>
+        <w:t>Ao inserir um novo valor, ele deve ser colocado na posição correta para manter a lista ordenada.</w:t>
+      </w:r>
+    </w:p>
+    <w:p>
+      <w:pPr>
+        <w:numPr>
+          <w:ilvl w:val="0"/>
+          <w:numId w:val="6"/>
+        </w:numPr>
+      </w:pPr>
+      <w:r>
+        <w:t>Crie um método para imprimir todos os elementos da lista.</w:t>
+      </w:r>
+    </w:p>
+    <w:p>
+      <w:pPr>
+        <w:spacing w:after="0"/>
+        <w:rPr>
+          <w:color w:val="EE0000"/>
+        </w:rPr>
+      </w:pPr>
+      <w:proofErr w:type="spellStart"/>
+      <w:r>
+        <w:rPr>
+          <w:color w:val="EE0000"/>
+        </w:rPr>
+        <w:t>class</w:t>
+      </w:r>
+      <w:proofErr w:type="spellEnd"/>
+      <w:r>
+        <w:rPr>
+          <w:color w:val="EE0000"/>
+        </w:rPr>
+        <w:t xml:space="preserve"> Node:</w:t>
+      </w:r>
+    </w:p>
+    <w:p>
+      <w:pPr>
+        <w:spacing w:after="0"/>
+        <w:rPr>
+          <w:color w:val="EE0000"/>
+        </w:rPr>
+      </w:pPr>
+      <w:r>
+        <w:rPr>
+          <w:color w:val="EE0000"/>
+        </w:rPr>
+        <w:t xml:space="preserve">    </w:t>
+      </w:r>
+      <w:proofErr w:type="spellStart"/>
+      <w:r>
+        <w:rPr>
+          <w:color w:val="EE0000"/>
+        </w:rPr>
+        <w:t>def</w:t>
+      </w:r>
+      <w:proofErr w:type="spellEnd"/>
+      <w:r>
+        <w:rPr>
+          <w:color w:val="EE0000"/>
+        </w:rPr>
+        <w:t xml:space="preserve"> __</w:t>
+      </w:r>
+      <w:proofErr w:type="spellStart"/>
+      <w:r>
+        <w:rPr>
+          <w:color w:val="EE0000"/>
+        </w:rPr>
+        <w:t>init</w:t>
+      </w:r>
+      <w:proofErr w:type="spellEnd"/>
+      <w:r>
+        <w:rPr>
+          <w:color w:val="EE0000"/>
+        </w:rPr>
+        <w:t>_</w:t>
+      </w:r>
+      <w:proofErr w:type="gramStart"/>
+      <w:r>
+        <w:rPr>
+          <w:color w:val="EE0000"/>
+        </w:rPr>
+        <w:t>_(</w:t>
+      </w:r>
+      <w:proofErr w:type="gramEnd"/>
+      <w:r>
+        <w:rPr>
+          <w:color w:val="EE0000"/>
+        </w:rPr>
+        <w:t>self, data):</w:t>
+      </w:r>
+    </w:p>
+    <w:p>
+      <w:pPr>
+        <w:spacing w:after="0"/>
+        <w:rPr>
+          <w:color w:val="EE0000"/>
+        </w:rPr>
+      </w:pPr>
+      <w:r>
+        <w:rPr>
+          <w:color w:val="EE0000"/>
+        </w:rPr>
+        <w:t xml:space="preserve">        </w:t>
+      </w:r>
+      <w:proofErr w:type="spellStart"/>
+      <w:r>
+        <w:rPr>
+          <w:color w:val="EE0000"/>
+        </w:rPr>
+        <w:t>self.data</w:t>
+      </w:r>
+      <w:proofErr w:type="spellEnd"/>
+      <w:r>
+        <w:rPr>
+          <w:color w:val="EE0000"/>
+        </w:rPr>
+        <w:t xml:space="preserve"> = data</w:t>
+      </w:r>
+    </w:p>
+    <w:p>
+      <w:pPr>
+        <w:spacing w:after="0"/>
+        <w:rPr>
+          <w:color w:val="EE0000"/>
+        </w:rPr>
+      </w:pPr>
+      <w:r>
+        <w:rPr>
+          <w:color w:val="EE0000"/>
+        </w:rPr>
+        <w:t xml:space="preserve">        </w:t>
+      </w:r>
+      <w:proofErr w:type="spellStart"/>
+      <w:proofErr w:type="gramStart"/>
+      <w:r>
+        <w:rPr>
+          <w:color w:val="EE0000"/>
+        </w:rPr>
+        <w:t>self.next</w:t>
+      </w:r>
+      <w:proofErr w:type="spellEnd"/>
+      <w:proofErr w:type="gramEnd"/>
+      <w:r>
+        <w:rPr>
+          <w:color w:val="EE0000"/>
+        </w:rPr>
+        <w:t xml:space="preserve"> = </w:t>
+      </w:r>
+      <w:proofErr w:type="spellStart"/>
+      <w:r>
+        <w:rPr>
+          <w:color w:val="EE0000"/>
+        </w:rPr>
+        <w:t>None</w:t>
+      </w:r>
+      <w:proofErr w:type="spellEnd"/>
+    </w:p>
+    <w:p>
+      <w:pPr>
+        <w:spacing w:after="0"/>
+        <w:rPr>
+          <w:color w:val="EE0000"/>
+        </w:rPr>
+      </w:pPr>
+    </w:p>
+    <w:p>
+      <w:pPr>
+        <w:spacing w:after="0"/>
+        <w:rPr>
+          <w:color w:val="EE0000"/>
+        </w:rPr>
+      </w:pPr>
+      <w:proofErr w:type="spellStart"/>
+      <w:r>
+        <w:rPr>
+          <w:color w:val="EE0000"/>
+        </w:rPr>
+        <w:t>class</w:t>
+      </w:r>
+      <w:proofErr w:type="spellEnd"/>
+      <w:r>
+        <w:rPr>
+          <w:color w:val="EE0000"/>
+        </w:rPr>
+        <w:t xml:space="preserve"> </w:t>
+      </w:r>
+      <w:proofErr w:type="spellStart"/>
+      <w:r>
+        <w:rPr>
+          <w:color w:val="EE0000"/>
+        </w:rPr>
+        <w:t>LinkedList</w:t>
+      </w:r>
+      <w:proofErr w:type="spellEnd"/>
+      <w:r>
+        <w:rPr>
+          <w:color w:val="EE0000"/>
+        </w:rPr>
+        <w:t>:</w:t>
+      </w:r>
+    </w:p>
+    <w:p>
+      <w:pPr>
+        <w:spacing w:after="0"/>
+        <w:rPr>
+          <w:color w:val="EE0000"/>
+        </w:rPr>
+      </w:pPr>
+      <w:r>
+        <w:rPr>
+          <w:color w:val="EE0000"/>
+        </w:rPr>
+        <w:t xml:space="preserve">    </w:t>
+      </w:r>
+      <w:proofErr w:type="spellStart"/>
+      <w:r>
+        <w:rPr>
+          <w:color w:val="EE0000"/>
+        </w:rPr>
+        <w:t>def</w:t>
+      </w:r>
+      <w:proofErr w:type="spellEnd"/>
+      <w:r>
+        <w:rPr>
+          <w:color w:val="EE0000"/>
+        </w:rPr>
+        <w:t xml:space="preserve"> __</w:t>
+      </w:r>
+      <w:proofErr w:type="spellStart"/>
+      <w:r>
+        <w:rPr>
+          <w:color w:val="EE0000"/>
+        </w:rPr>
+        <w:t>init</w:t>
+      </w:r>
+      <w:proofErr w:type="spellEnd"/>
+      <w:r>
+        <w:rPr>
+          <w:color w:val="EE0000"/>
+        </w:rPr>
+        <w:t>__(self):</w:t>
+      </w:r>
+    </w:p>
+    <w:p>
+      <w:pPr>
+        <w:spacing w:after="0"/>
+        <w:rPr>
+          <w:color w:val="EE0000"/>
+        </w:rPr>
+      </w:pPr>
+      <w:r>
+        <w:rPr>
+          <w:color w:val="EE0000"/>
+        </w:rPr>
+        <w:t xml:space="preserve">        </w:t>
+      </w:r>
+      <w:proofErr w:type="spellStart"/>
+      <w:proofErr w:type="gramStart"/>
+      <w:r>
+        <w:rPr>
+          <w:color w:val="EE0000"/>
+        </w:rPr>
+        <w:t>self.head</w:t>
+      </w:r>
+      <w:proofErr w:type="spellEnd"/>
+      <w:proofErr w:type="gramEnd"/>
+      <w:r>
+        <w:rPr>
+          <w:color w:val="EE0000"/>
+        </w:rPr>
+        <w:t xml:space="preserve"> = </w:t>
+      </w:r>
+      <w:proofErr w:type="spellStart"/>
+      <w:r>
+        <w:rPr>
+          <w:color w:val="EE0000"/>
+        </w:rPr>
+        <w:t>None</w:t>
+      </w:r>
+      <w:proofErr w:type="spellEnd"/>
+    </w:p>
+    <w:p>
+      <w:pPr>
+        <w:spacing w:after="0"/>
+        <w:rPr>
+          <w:color w:val="EE0000"/>
+        </w:rPr>
+      </w:pPr>
+    </w:p>
+    <w:p>
+      <w:pPr>
+        <w:spacing w:after="0"/>
+        <w:rPr>
+          <w:color w:val="EE0000"/>
+        </w:rPr>
+      </w:pPr>
+      <w:r>
+        <w:rPr>
+          <w:color w:val="EE0000"/>
+        </w:rPr>
+        <w:t xml:space="preserve">    </w:t>
+      </w:r>
+      <w:proofErr w:type="spellStart"/>
+      <w:r>
+        <w:rPr>
+          <w:color w:val="EE0000"/>
+        </w:rPr>
+        <w:t>def</w:t>
+      </w:r>
+      <w:proofErr w:type="spellEnd"/>
+      <w:r>
+        <w:rPr>
+          <w:color w:val="EE0000"/>
+        </w:rPr>
+        <w:t xml:space="preserve"> </w:t>
+      </w:r>
+      <w:proofErr w:type="spellStart"/>
+      <w:r>
+        <w:rPr>
+          <w:color w:val="EE0000"/>
+        </w:rPr>
+        <w:t>insert_</w:t>
+      </w:r>
+      <w:proofErr w:type="gramStart"/>
+      <w:r>
+        <w:rPr>
+          <w:color w:val="EE0000"/>
+        </w:rPr>
+        <w:t>sorted</w:t>
+      </w:r>
+      <w:proofErr w:type="spellEnd"/>
+      <w:r>
+        <w:rPr>
+          <w:color w:val="EE0000"/>
+        </w:rPr>
+        <w:t>(</w:t>
+      </w:r>
+      <w:proofErr w:type="gramEnd"/>
+      <w:r>
+        <w:rPr>
+          <w:color w:val="EE0000"/>
+        </w:rPr>
+        <w:t>self, data):</w:t>
+      </w:r>
+    </w:p>
+    <w:p>
+      <w:pPr>
+        <w:spacing w:after="0"/>
+        <w:rPr>
+          <w:color w:val="EE0000"/>
+        </w:rPr>
+      </w:pPr>
+      <w:r>
+        <w:rPr>
+          <w:color w:val="EE0000"/>
+        </w:rPr>
+        <w:t xml:space="preserve">        </w:t>
+      </w:r>
+      <w:proofErr w:type="spellStart"/>
+      <w:r>
+        <w:rPr>
+          <w:color w:val="EE0000"/>
+        </w:rPr>
+        <w:t>new_node</w:t>
+      </w:r>
+      <w:proofErr w:type="spellEnd"/>
+      <w:r>
+        <w:rPr>
+          <w:color w:val="EE0000"/>
+        </w:rPr>
+        <w:t xml:space="preserve"> = Node(data)</w:t>
+      </w:r>
+    </w:p>
+    <w:p>
+      <w:pPr>
+        <w:spacing w:after="0"/>
+        <w:rPr>
+          <w:color w:val="EE0000"/>
+        </w:rPr>
+      </w:pPr>
+    </w:p>
+    <w:p>
+      <w:pPr>
+        <w:spacing w:after="0"/>
+        <w:rPr>
+          <w:color w:val="EE0000"/>
+        </w:rPr>
+      </w:pPr>
+      <w:r>
+        <w:rPr>
+          <w:color w:val="EE0000"/>
+        </w:rPr>
+        <w:t xml:space="preserve">        # Caso a lista esteja vazia ou o novo valor seja menor que o primeiro</w:t>
+      </w:r>
+    </w:p>
+    <w:p>
+      <w:pPr>
+        <w:spacing w:after="0"/>
+        <w:rPr>
+          <w:color w:val="EE0000"/>
+        </w:rPr>
+      </w:pPr>
+      <w:r>
+        <w:rPr>
+          <w:color w:val="EE0000"/>
+        </w:rPr>
+        <w:t xml:space="preserve">        </w:t>
+      </w:r>
+      <w:proofErr w:type="spellStart"/>
+      <w:r>
+        <w:rPr>
+          <w:color w:val="EE0000"/>
+        </w:rPr>
+        <w:t>if</w:t>
+      </w:r>
+      <w:proofErr w:type="spellEnd"/>
+      <w:r>
+        <w:rPr>
+          <w:color w:val="EE0000"/>
+        </w:rPr>
+        <w:t xml:space="preserve"> </w:t>
+      </w:r>
+      <w:proofErr w:type="spellStart"/>
+      <w:proofErr w:type="gramStart"/>
+      <w:r>
+        <w:rPr>
+          <w:color w:val="EE0000"/>
+        </w:rPr>
+        <w:t>self.head</w:t>
+      </w:r>
+      <w:proofErr w:type="spellEnd"/>
+      <w:proofErr w:type="gramEnd"/>
+      <w:r>
+        <w:rPr>
+          <w:color w:val="EE0000"/>
+        </w:rPr>
+        <w:t xml:space="preserve"> </w:t>
+      </w:r>
+      <w:proofErr w:type="spellStart"/>
+      <w:r>
+        <w:rPr>
+          <w:color w:val="EE0000"/>
+        </w:rPr>
+        <w:t>is</w:t>
+      </w:r>
+      <w:proofErr w:type="spellEnd"/>
+      <w:r>
+        <w:rPr>
+          <w:color w:val="EE0000"/>
+        </w:rPr>
+        <w:t xml:space="preserve"> </w:t>
+      </w:r>
+      <w:proofErr w:type="spellStart"/>
+      <w:r>
+        <w:rPr>
+          <w:color w:val="EE0000"/>
+        </w:rPr>
+        <w:t>None</w:t>
+      </w:r>
+      <w:proofErr w:type="spellEnd"/>
+      <w:r>
+        <w:rPr>
+          <w:color w:val="EE0000"/>
+        </w:rPr>
+        <w:t xml:space="preserve"> </w:t>
+      </w:r>
+      <w:proofErr w:type="spellStart"/>
+      <w:r>
+        <w:rPr>
+          <w:color w:val="EE0000"/>
+        </w:rPr>
+        <w:t>or</w:t>
+      </w:r>
+      <w:proofErr w:type="spellEnd"/>
+      <w:r>
+        <w:rPr>
+          <w:color w:val="EE0000"/>
+        </w:rPr>
+        <w:t xml:space="preserve"> data &lt; </w:t>
+      </w:r>
+      <w:proofErr w:type="spellStart"/>
+      <w:proofErr w:type="gramStart"/>
+      <w:r>
+        <w:rPr>
+          <w:color w:val="EE0000"/>
+        </w:rPr>
+        <w:t>self.head</w:t>
+      </w:r>
+      <w:proofErr w:type="gramEnd"/>
+      <w:r>
+        <w:rPr>
+          <w:color w:val="EE0000"/>
+        </w:rPr>
+        <w:t>.data</w:t>
+      </w:r>
+      <w:proofErr w:type="spellEnd"/>
+      <w:r>
+        <w:rPr>
+          <w:color w:val="EE0000"/>
+        </w:rPr>
+        <w:t>:</w:t>
+      </w:r>
+    </w:p>
+    <w:p>
+      <w:pPr>
+        <w:spacing w:after="0"/>
+        <w:rPr>
+          <w:color w:val="EE0000"/>
+        </w:rPr>
+      </w:pPr>
+      <w:r>
+        <w:rPr>
+          <w:color w:val="EE0000"/>
+        </w:rPr>
+        <w:t xml:space="preserve">            </w:t>
+      </w:r>
+      <w:proofErr w:type="spellStart"/>
+      <w:r>
+        <w:rPr>
+          <w:color w:val="EE0000"/>
+        </w:rPr>
+        <w:t>new_</w:t>
+      </w:r>
+      <w:proofErr w:type="gramStart"/>
+      <w:r>
+        <w:rPr>
+          <w:color w:val="EE0000"/>
+        </w:rPr>
+        <w:t>node.next</w:t>
+      </w:r>
+      <w:proofErr w:type="spellEnd"/>
+      <w:proofErr w:type="gramEnd"/>
+      <w:r>
+        <w:rPr>
+          <w:color w:val="EE0000"/>
+        </w:rPr>
+        <w:t xml:space="preserve"> = </w:t>
+      </w:r>
+      <w:proofErr w:type="spellStart"/>
+      <w:proofErr w:type="gramStart"/>
+      <w:r>
+        <w:rPr>
+          <w:color w:val="EE0000"/>
+        </w:rPr>
+        <w:t>self.head</w:t>
+      </w:r>
+      <w:proofErr w:type="spellEnd"/>
+      <w:proofErr w:type="gramEnd"/>
+    </w:p>
+    <w:p>
+      <w:pPr>
+        <w:spacing w:after="0"/>
+        <w:rPr>
+          <w:color w:val="EE0000"/>
+        </w:rPr>
+      </w:pPr>
+      <w:r>
+        <w:rPr>
+          <w:color w:val="EE0000"/>
+        </w:rPr>
+        <w:t xml:space="preserve">            </w:t>
+      </w:r>
+      <w:proofErr w:type="spellStart"/>
+      <w:proofErr w:type="gramStart"/>
+      <w:r>
+        <w:rPr>
+          <w:color w:val="EE0000"/>
+        </w:rPr>
+        <w:t>self.head</w:t>
+      </w:r>
+      <w:proofErr w:type="spellEnd"/>
+      <w:proofErr w:type="gramEnd"/>
+      <w:r>
+        <w:rPr>
+          <w:color w:val="EE0000"/>
+        </w:rPr>
+        <w:t xml:space="preserve"> = </w:t>
+      </w:r>
+      <w:proofErr w:type="spellStart"/>
+      <w:r>
+        <w:rPr>
+          <w:color w:val="EE0000"/>
+        </w:rPr>
+        <w:t>new_node</w:t>
+      </w:r>
+      <w:proofErr w:type="spellEnd"/>
+    </w:p>
+    <w:p>
+      <w:pPr>
+        <w:spacing w:after="0"/>
+        <w:rPr>
+          <w:color w:val="EE0000"/>
+        </w:rPr>
+      </w:pPr>
+      <w:r>
+        <w:rPr>
+          <w:color w:val="EE0000"/>
+        </w:rPr>
+        <w:t xml:space="preserve">            </w:t>
+      </w:r>
+      <w:proofErr w:type="spellStart"/>
+      <w:r>
+        <w:rPr>
+          <w:color w:val="EE0000"/>
+        </w:rPr>
+        <w:t>return</w:t>
+      </w:r>
+      <w:proofErr w:type="spellEnd"/>
+    </w:p>
+    <w:p>
+      <w:pPr>
+        <w:spacing w:after="0"/>
+        <w:rPr>
+          <w:color w:val="EE0000"/>
+        </w:rPr>
+      </w:pPr>
+    </w:p>
+    <w:p>
+      <w:pPr>
+        <w:spacing w:after="0"/>
+        <w:rPr>
+          <w:color w:val="EE0000"/>
+        </w:rPr>
+      </w:pPr>
+      <w:r>
+        <w:rPr>
+          <w:color w:val="EE0000"/>
+        </w:rPr>
+        <w:t xml:space="preserve">        # Percorre até encontrar a posição correta</w:t>
+      </w:r>
+    </w:p>
+    <w:p>
+      <w:pPr>
+        <w:spacing w:after="0"/>
+        <w:rPr>
+          <w:color w:val="EE0000"/>
+        </w:rPr>
+      </w:pPr>
+      <w:r>
+        <w:rPr>
+          <w:color w:val="EE0000"/>
+        </w:rPr>
+        <w:t xml:space="preserve">        </w:t>
+      </w:r>
+      <w:proofErr w:type="spellStart"/>
+      <w:r>
+        <w:rPr>
+          <w:color w:val="EE0000"/>
+        </w:rPr>
+        <w:t>current</w:t>
+      </w:r>
+      <w:proofErr w:type="spellEnd"/>
+      <w:r>
+        <w:rPr>
+          <w:color w:val="EE0000"/>
+        </w:rPr>
+        <w:t xml:space="preserve"> = </w:t>
+      </w:r>
+      <w:proofErr w:type="spellStart"/>
+      <w:proofErr w:type="gramStart"/>
+      <w:r>
+        <w:rPr>
+          <w:color w:val="EE0000"/>
+        </w:rPr>
+        <w:t>self.head</w:t>
+      </w:r>
+      <w:proofErr w:type="spellEnd"/>
+      <w:proofErr w:type="gramEnd"/>
+    </w:p>
+    <w:p>
+      <w:pPr>
+        <w:spacing w:after="0"/>
+        <w:rPr>
+          <w:color w:val="EE0000"/>
+        </w:rPr>
+      </w:pPr>
+      <w:r>
+        <w:rPr>
+          <w:color w:val="EE0000"/>
+        </w:rPr>
+        <w:t xml:space="preserve">        </w:t>
+      </w:r>
+      <w:proofErr w:type="spellStart"/>
+      <w:r>
+        <w:rPr>
+          <w:color w:val="EE0000"/>
+        </w:rPr>
+        <w:t>while</w:t>
+      </w:r>
+      <w:proofErr w:type="spellEnd"/>
+      <w:r>
+        <w:rPr>
+          <w:color w:val="EE0000"/>
+        </w:rPr>
+        <w:t xml:space="preserve"> </w:t>
+      </w:r>
+      <w:proofErr w:type="spellStart"/>
+      <w:proofErr w:type="gramStart"/>
+      <w:r>
+        <w:rPr>
+          <w:color w:val="EE0000"/>
+        </w:rPr>
+        <w:t>current.next</w:t>
+      </w:r>
+      <w:proofErr w:type="spellEnd"/>
+      <w:proofErr w:type="gramEnd"/>
+      <w:r>
+        <w:rPr>
+          <w:color w:val="EE0000"/>
+        </w:rPr>
+        <w:t xml:space="preserve"> </w:t>
+      </w:r>
+      <w:proofErr w:type="spellStart"/>
+      <w:r>
+        <w:rPr>
+          <w:color w:val="EE0000"/>
+        </w:rPr>
+        <w:t>is</w:t>
+      </w:r>
+      <w:proofErr w:type="spellEnd"/>
+      <w:r>
+        <w:rPr>
+          <w:color w:val="EE0000"/>
+        </w:rPr>
+        <w:t xml:space="preserve"> </w:t>
+      </w:r>
+      <w:proofErr w:type="spellStart"/>
+      <w:r>
+        <w:rPr>
+          <w:color w:val="EE0000"/>
+        </w:rPr>
+        <w:t>not</w:t>
+      </w:r>
+      <w:proofErr w:type="spellEnd"/>
+      <w:r>
+        <w:rPr>
+          <w:color w:val="EE0000"/>
+        </w:rPr>
+        <w:t xml:space="preserve"> </w:t>
+      </w:r>
+      <w:proofErr w:type="spellStart"/>
+      <w:r>
+        <w:rPr>
+          <w:color w:val="EE0000"/>
+        </w:rPr>
+        <w:t>None</w:t>
+      </w:r>
+      <w:proofErr w:type="spellEnd"/>
+      <w:r>
+        <w:rPr>
+          <w:color w:val="EE0000"/>
+        </w:rPr>
+        <w:t xml:space="preserve"> </w:t>
+      </w:r>
+      <w:proofErr w:type="spellStart"/>
+      <w:r>
+        <w:rPr>
+          <w:color w:val="EE0000"/>
+        </w:rPr>
+        <w:t>and</w:t>
+      </w:r>
+      <w:proofErr w:type="spellEnd"/>
+      <w:r>
+        <w:rPr>
+          <w:color w:val="EE0000"/>
+        </w:rPr>
+        <w:t xml:space="preserve"> </w:t>
+      </w:r>
+      <w:proofErr w:type="spellStart"/>
+      <w:proofErr w:type="gramStart"/>
+      <w:r>
+        <w:rPr>
+          <w:color w:val="EE0000"/>
+        </w:rPr>
+        <w:t>current.next</w:t>
+      </w:r>
+      <w:proofErr w:type="gramEnd"/>
+      <w:r>
+        <w:rPr>
+          <w:color w:val="EE0000"/>
+        </w:rPr>
+        <w:t>.data</w:t>
+      </w:r>
+      <w:proofErr w:type="spellEnd"/>
+      <w:r>
+        <w:rPr>
+          <w:color w:val="EE0000"/>
+        </w:rPr>
+        <w:t xml:space="preserve"> &lt; data:</w:t>
+      </w:r>
+    </w:p>
+    <w:p>
+      <w:pPr>
+        <w:spacing w:after="0"/>
+        <w:rPr>
+          <w:color w:val="EE0000"/>
+        </w:rPr>
+      </w:pPr>
+      <w:r>
+        <w:rPr>
+          <w:color w:val="EE0000"/>
+        </w:rPr>
+        <w:t xml:space="preserve">            </w:t>
+      </w:r>
+      <w:proofErr w:type="spellStart"/>
+      <w:r>
+        <w:rPr>
+          <w:color w:val="EE0000"/>
+        </w:rPr>
+        <w:t>current</w:t>
+      </w:r>
+      <w:proofErr w:type="spellEnd"/>
+      <w:r>
+        <w:rPr>
+          <w:color w:val="EE0000"/>
+        </w:rPr>
+        <w:t xml:space="preserve"> = </w:t>
+      </w:r>
+      <w:proofErr w:type="spellStart"/>
+      <w:proofErr w:type="gramStart"/>
+      <w:r>
+        <w:rPr>
+          <w:color w:val="EE0000"/>
+        </w:rPr>
+        <w:t>current.next</w:t>
+      </w:r>
+      <w:proofErr w:type="spellEnd"/>
+      <w:proofErr w:type="gramEnd"/>
+    </w:p>
+    <w:p>
+      <w:pPr>
+        <w:spacing w:after="0"/>
+        <w:rPr>
+          <w:color w:val="EE0000"/>
+        </w:rPr>
+      </w:pPr>
+    </w:p>
+    <w:p>
+      <w:pPr>
+        <w:spacing w:after="0"/>
+        <w:rPr>
+          <w:color w:val="EE0000"/>
+        </w:rPr>
+      </w:pPr>
+      <w:r>
+        <w:rPr>
+          <w:color w:val="EE0000"/>
+        </w:rPr>
+        <w:t xml:space="preserve">        </w:t>
+      </w:r>
+      <w:proofErr w:type="spellStart"/>
+      <w:r>
+        <w:rPr>
+          <w:color w:val="EE0000"/>
+        </w:rPr>
+        <w:t>new_</w:t>
+      </w:r>
+      <w:proofErr w:type="gramStart"/>
+      <w:r>
+        <w:rPr>
+          <w:color w:val="EE0000"/>
+        </w:rPr>
+        <w:t>node.next</w:t>
+      </w:r>
+      <w:proofErr w:type="spellEnd"/>
+      <w:proofErr w:type="gramEnd"/>
+      <w:r>
+        <w:rPr>
+          <w:color w:val="EE0000"/>
+        </w:rPr>
+        <w:t xml:space="preserve"> = </w:t>
+      </w:r>
+      <w:proofErr w:type="spellStart"/>
+      <w:proofErr w:type="gramStart"/>
+      <w:r>
+        <w:rPr>
+          <w:color w:val="EE0000"/>
+        </w:rPr>
+        <w:t>current.next</w:t>
+      </w:r>
+      <w:proofErr w:type="spellEnd"/>
+      <w:proofErr w:type="gramEnd"/>
+    </w:p>
+    <w:p>
+      <w:pPr>
+        <w:spacing w:after="0"/>
+        <w:rPr>
+          <w:color w:val="EE0000"/>
+        </w:rPr>
+      </w:pPr>
+      <w:r>
+        <w:rPr>
+          <w:color w:val="EE0000"/>
+        </w:rPr>
+        <w:t xml:space="preserve">        </w:t>
+      </w:r>
+      <w:proofErr w:type="spellStart"/>
+      <w:proofErr w:type="gramStart"/>
+      <w:r>
+        <w:rPr>
+          <w:color w:val="EE0000"/>
+        </w:rPr>
+        <w:t>current.next</w:t>
+      </w:r>
+      <w:proofErr w:type="spellEnd"/>
+      <w:proofErr w:type="gramEnd"/>
+      <w:r>
+        <w:rPr>
+          <w:color w:val="EE0000"/>
+        </w:rPr>
+        <w:t xml:space="preserve"> = </w:t>
+      </w:r>
+      <w:proofErr w:type="spellStart"/>
+      <w:r>
+        <w:rPr>
+          <w:color w:val="EE0000"/>
+        </w:rPr>
+        <w:t>new_node</w:t>
+      </w:r>
+      <w:proofErr w:type="spellEnd"/>
+    </w:p>
+    <w:p>
+      <w:pPr>
+        <w:spacing w:after="0"/>
+        <w:rPr>
+          <w:color w:val="EE0000"/>
+        </w:rPr>
+      </w:pPr>
+    </w:p>
+    <w:p>
+      <w:pPr>
+        <w:spacing w:after="0"/>
+        <w:rPr>
+          <w:color w:val="EE0000"/>
+        </w:rPr>
+      </w:pPr>
+      <w:r>
+        <w:rPr>
+          <w:color w:val="EE0000"/>
+        </w:rPr>
+        <w:t xml:space="preserve">    </w:t>
+      </w:r>
+      <w:proofErr w:type="spellStart"/>
+      <w:r>
+        <w:rPr>
+          <w:color w:val="EE0000"/>
+        </w:rPr>
+        <w:t>def</w:t>
+      </w:r>
+      <w:proofErr w:type="spellEnd"/>
+      <w:r>
+        <w:rPr>
+          <w:color w:val="EE0000"/>
+        </w:rPr>
+        <w:t xml:space="preserve"> </w:t>
+      </w:r>
+      <w:proofErr w:type="spellStart"/>
+      <w:r>
+        <w:rPr>
+          <w:color w:val="EE0000"/>
+        </w:rPr>
+        <w:t>print_list</w:t>
+      </w:r>
+      <w:proofErr w:type="spellEnd"/>
+      <w:r>
+        <w:rPr>
+          <w:color w:val="EE0000"/>
+        </w:rPr>
+        <w:t>(self):</w:t>
+      </w:r>
+    </w:p>
+    <w:p>
+      <w:pPr>
+        <w:spacing w:after="0"/>
+        <w:rPr>
+          <w:color w:val="EE0000"/>
+        </w:rPr>
+      </w:pPr>
+      <w:r>
+        <w:rPr>
+          <w:color w:val="EE0000"/>
+        </w:rPr>
+        <w:t xml:space="preserve">        </w:t>
+      </w:r>
+      <w:proofErr w:type="spellStart"/>
+      <w:r>
+        <w:rPr>
+          <w:color w:val="EE0000"/>
+        </w:rPr>
+        <w:t>current</w:t>
+      </w:r>
+      <w:proofErr w:type="spellEnd"/>
+      <w:r>
+        <w:rPr>
+          <w:color w:val="EE0000"/>
+        </w:rPr>
+        <w:t xml:space="preserve"> = </w:t>
+      </w:r>
+      <w:proofErr w:type="spellStart"/>
+      <w:proofErr w:type="gramStart"/>
+      <w:r>
+        <w:rPr>
+          <w:color w:val="EE0000"/>
+        </w:rPr>
+        <w:t>self.head</w:t>
+      </w:r>
+      <w:proofErr w:type="spellEnd"/>
+      <w:proofErr w:type="gramEnd"/>
+    </w:p>
+    <w:p>
+      <w:pPr>
+        <w:spacing w:after="0"/>
+        <w:rPr>
+          <w:color w:val="EE0000"/>
+        </w:rPr>
+      </w:pPr>
+      <w:r>
+        <w:rPr>
+          <w:color w:val="EE0000"/>
+        </w:rPr>
+        <w:t xml:space="preserve">        </w:t>
+      </w:r>
+      <w:proofErr w:type="spellStart"/>
+      <w:r>
+        <w:rPr>
+          <w:color w:val="EE0000"/>
+        </w:rPr>
+        <w:t>while</w:t>
+      </w:r>
+      <w:proofErr w:type="spellEnd"/>
+      <w:r>
+        <w:rPr>
+          <w:color w:val="EE0000"/>
+        </w:rPr>
+        <w:t xml:space="preserve"> </w:t>
+      </w:r>
+      <w:proofErr w:type="spellStart"/>
+      <w:r>
+        <w:rPr>
+          <w:color w:val="EE0000"/>
+        </w:rPr>
+        <w:t>current</w:t>
+      </w:r>
+      <w:proofErr w:type="spellEnd"/>
+      <w:r>
+        <w:rPr>
+          <w:color w:val="EE0000"/>
+        </w:rPr>
+        <w:t>:</w:t>
+      </w:r>
+    </w:p>
+    <w:p>
+      <w:pPr>
+        <w:spacing w:after="0"/>
+        <w:rPr>
+          <w:color w:val="EE0000"/>
+        </w:rPr>
+      </w:pPr>
+      <w:r>
+        <w:rPr>
+          <w:color w:val="EE0000"/>
+        </w:rPr>
+        <w:t xml:space="preserve">            </w:t>
+      </w:r>
+      <w:proofErr w:type="gramStart"/>
+      <w:r>
+        <w:rPr>
+          <w:color w:val="EE0000"/>
+        </w:rPr>
+        <w:t>print(</w:t>
+      </w:r>
+      <w:proofErr w:type="spellStart"/>
+      <w:proofErr w:type="gramEnd"/>
+      <w:r>
+        <w:rPr>
+          <w:color w:val="EE0000"/>
+        </w:rPr>
+        <w:t>current.data</w:t>
+      </w:r>
+      <w:proofErr w:type="spellEnd"/>
+      <w:r>
+        <w:rPr>
+          <w:color w:val="EE0000"/>
+        </w:rPr>
+        <w:t xml:space="preserve">, </w:t>
+      </w:r>
+      <w:proofErr w:type="spellStart"/>
+      <w:r>
+        <w:rPr>
+          <w:color w:val="EE0000"/>
+        </w:rPr>
+        <w:t>end</w:t>
+      </w:r>
+      <w:proofErr w:type="spellEnd"/>
+      <w:r>
+        <w:rPr>
+          <w:color w:val="EE0000"/>
+        </w:rPr>
+        <w:t>=" -&gt; ")</w:t>
+      </w:r>
+    </w:p>
+    <w:p>
+      <w:pPr>
+        <w:spacing w:after="0"/>
+        <w:rPr>
+          <w:color w:val="EE0000"/>
+        </w:rPr>
+      </w:pPr>
+      <w:r>
+        <w:rPr>
+          <w:color w:val="EE0000"/>
+        </w:rPr>
+        <w:t xml:space="preserve">            </w:t>
+      </w:r>
+      <w:proofErr w:type="spellStart"/>
+      <w:r>
+        <w:rPr>
+          <w:color w:val="EE0000"/>
+        </w:rPr>
+        <w:t>current</w:t>
+      </w:r>
+      <w:proofErr w:type="spellEnd"/>
+      <w:r>
+        <w:rPr>
+          <w:color w:val="EE0000"/>
+        </w:rPr>
+        <w:t xml:space="preserve"> = </w:t>
+      </w:r>
+      <w:proofErr w:type="spellStart"/>
+      <w:proofErr w:type="gramStart"/>
+      <w:r>
+        <w:rPr>
+          <w:color w:val="EE0000"/>
+        </w:rPr>
+        <w:t>current.next</w:t>
+      </w:r>
+      <w:proofErr w:type="spellEnd"/>
+      <w:proofErr w:type="gramEnd"/>
+    </w:p>
+    <w:p>
+      <w:pPr>
+        <w:spacing w:after="0"/>
+        <w:rPr>
+          <w:color w:val="EE0000"/>
+        </w:rPr>
+      </w:pPr>
+      <w:r>
+        <w:rPr>
+          <w:color w:val="EE0000"/>
+        </w:rPr>
+        <w:t xml:space="preserve">        print("</w:t>
+      </w:r>
+      <w:proofErr w:type="spellStart"/>
+      <w:r>
+        <w:rPr>
+          <w:color w:val="EE0000"/>
+        </w:rPr>
+        <w:t>None</w:t>
+      </w:r>
+      <w:proofErr w:type="spellEnd"/>
+      <w:r>
+        <w:rPr>
+          <w:color w:val="EE0000"/>
+        </w:rPr>
+        <w:t>")</w:t>
+      </w:r>
+    </w:p>
+    <w:p>
+      <w:pPr>
+        <w:spacing w:after="0"/>
+        <w:rPr>
+          <w:color w:val="EE0000"/>
+        </w:rPr>
+      </w:pPr>
+    </w:p>
+    <w:p>
+      <w:pPr>
+        <w:rPr>
+          <w:color w:val="EE0000"/>
+        </w:rPr>
+      </w:pPr>
+      <w:r>
+        <w:rPr>
+          <w:color w:val="EE0000"/>
+        </w:rPr>
+        <w:t># Inserção de elementos em uma lista ordenada diretamente na inserção</w:t>
+      </w:r>
+    </w:p>
+    <w:p>
+      <w:pPr>
+        <w:rPr>
+          <w:color w:val="EE0000"/>
+          <w:lang w:eastAsia="pt-BR"/>
+        </w:rPr>
+      </w:pPr>
+      <w:r>
+        <w:rPr>
+          <w:color w:val="EE0000"/>
+          <w:lang w:eastAsia="pt-BR"/>
+        </w:rPr>
+        <w:t xml:space="preserve">lista = </w:t>
+      </w:r>
+      <w:proofErr w:type="spellStart"/>
+      <w:proofErr w:type="gramStart"/>
+      <w:r>
+        <w:rPr>
+          <w:color w:val="EE0000"/>
+          <w:lang w:eastAsia="pt-BR"/>
+        </w:rPr>
+        <w:t>LinkedList</w:t>
+      </w:r>
+      <w:proofErr w:type="spellEnd"/>
+      <w:r>
+        <w:rPr>
+          <w:color w:val="EE0000"/>
+          <w:lang w:eastAsia="pt-BR"/>
+        </w:rPr>
+        <w:t>(</w:t>
+      </w:r>
+      <w:proofErr w:type="gramEnd"/>
+      <w:r>
+        <w:rPr>
+          <w:color w:val="EE0000"/>
+          <w:lang w:eastAsia="pt-BR"/>
+        </w:rPr>
+        <w:t>)</w:t>
+      </w:r>
+    </w:p>
+    <w:p>
+      <w:pPr>
+        <w:rPr>
+          <w:color w:val="EE0000"/>
+          <w:lang w:eastAsia="pt-BR"/>
+        </w:rPr>
+      </w:pPr>
+      <w:proofErr w:type="spellStart"/>
+      <w:proofErr w:type="gramStart"/>
+      <w:r>
+        <w:rPr>
+          <w:color w:val="EE0000"/>
+          <w:lang w:eastAsia="pt-BR"/>
+        </w:rPr>
+        <w:t>lista.insert</w:t>
+      </w:r>
+      <w:proofErr w:type="gramEnd"/>
+      <w:r>
+        <w:rPr>
+          <w:color w:val="EE0000"/>
+          <w:lang w:eastAsia="pt-BR"/>
+        </w:rPr>
+        <w:t>_</w:t>
+      </w:r>
+      <w:proofErr w:type="gramStart"/>
+      <w:r>
+        <w:rPr>
+          <w:color w:val="EE0000"/>
+          <w:lang w:eastAsia="pt-BR"/>
+        </w:rPr>
+        <w:t>sorted</w:t>
+      </w:r>
+      <w:proofErr w:type="spellEnd"/>
+      <w:r>
+        <w:rPr>
+          <w:color w:val="EE0000"/>
+          <w:lang w:eastAsia="pt-BR"/>
+        </w:rPr>
+        <w:t>(</w:t>
+      </w:r>
+      <w:proofErr w:type="gramEnd"/>
+      <w:r>
+        <w:rPr>
+          <w:color w:val="EE0000"/>
+          <w:lang w:eastAsia="pt-BR"/>
+        </w:rPr>
+        <w:t>54)</w:t>
+      </w:r>
+    </w:p>
+    <w:p>
+      <w:pPr>
+        <w:rPr>
+          <w:color w:val="EE0000"/>
+          <w:lang w:eastAsia="pt-BR"/>
+        </w:rPr>
+      </w:pPr>
+      <w:proofErr w:type="spellStart"/>
+      <w:proofErr w:type="gramStart"/>
+      <w:r>
+        <w:rPr>
+          <w:color w:val="EE0000"/>
+          <w:lang w:eastAsia="pt-BR"/>
+        </w:rPr>
+        <w:t>lista.insert</w:t>
+      </w:r>
+      <w:proofErr w:type="gramEnd"/>
+      <w:r>
+        <w:rPr>
+          <w:color w:val="EE0000"/>
+          <w:lang w:eastAsia="pt-BR"/>
+        </w:rPr>
+        <w:t>_</w:t>
+      </w:r>
+      <w:proofErr w:type="gramStart"/>
+      <w:r>
+        <w:rPr>
+          <w:color w:val="EE0000"/>
+          <w:lang w:eastAsia="pt-BR"/>
+        </w:rPr>
+        <w:t>sorted</w:t>
+      </w:r>
+      <w:proofErr w:type="spellEnd"/>
+      <w:r>
+        <w:rPr>
+          <w:color w:val="EE0000"/>
+          <w:lang w:eastAsia="pt-BR"/>
+        </w:rPr>
+        <w:t>(</w:t>
+      </w:r>
+      <w:proofErr w:type="gramEnd"/>
+      <w:r>
+        <w:rPr>
+          <w:color w:val="EE0000"/>
+          <w:lang w:eastAsia="pt-BR"/>
+        </w:rPr>
+        <w:t>26)</w:t>
+      </w:r>
+    </w:p>
+    <w:p>
+      <w:pPr>
+        <w:rPr>
+          <w:color w:val="EE0000"/>
+          <w:lang w:eastAsia="pt-BR"/>
+        </w:rPr>
+      </w:pPr>
+      <w:proofErr w:type="spellStart"/>
+      <w:proofErr w:type="gramStart"/>
+      <w:r>
+        <w:rPr>
+          <w:color w:val="EE0000"/>
+          <w:lang w:eastAsia="pt-BR"/>
+        </w:rPr>
+        <w:t>lista.insert</w:t>
+      </w:r>
+      <w:proofErr w:type="gramEnd"/>
+      <w:r>
+        <w:rPr>
+          <w:color w:val="EE0000"/>
+          <w:lang w:eastAsia="pt-BR"/>
+        </w:rPr>
+        <w:t>_</w:t>
+      </w:r>
+      <w:proofErr w:type="gramStart"/>
+      <w:r>
+        <w:rPr>
+          <w:color w:val="EE0000"/>
+          <w:lang w:eastAsia="pt-BR"/>
+        </w:rPr>
+        <w:t>sorted</w:t>
+      </w:r>
+      <w:proofErr w:type="spellEnd"/>
+      <w:r>
+        <w:rPr>
+          <w:color w:val="EE0000"/>
+          <w:lang w:eastAsia="pt-BR"/>
+        </w:rPr>
+        <w:t>(</w:t>
+      </w:r>
+      <w:proofErr w:type="gramEnd"/>
+      <w:r>
+        <w:rPr>
+          <w:color w:val="EE0000"/>
+          <w:lang w:eastAsia="pt-BR"/>
+        </w:rPr>
+        <w:t>93)</w:t>
+      </w:r>
+    </w:p>
+    <w:p>
+      <w:pPr>
+        <w:rPr>
+          <w:color w:val="EE0000"/>
+          <w:lang w:eastAsia="pt-BR"/>
+        </w:rPr>
+      </w:pPr>
+      <w:proofErr w:type="spellStart"/>
+      <w:proofErr w:type="gramStart"/>
+      <w:r>
+        <w:rPr>
+          <w:color w:val="EE0000"/>
+          <w:lang w:eastAsia="pt-BR"/>
+        </w:rPr>
+        <w:t>lista.insert</w:t>
+      </w:r>
+      <w:proofErr w:type="gramEnd"/>
+      <w:r>
+        <w:rPr>
+          <w:color w:val="EE0000"/>
+          <w:lang w:eastAsia="pt-BR"/>
+        </w:rPr>
+        <w:t>_</w:t>
+      </w:r>
+      <w:proofErr w:type="gramStart"/>
+      <w:r>
+        <w:rPr>
+          <w:color w:val="EE0000"/>
+          <w:lang w:eastAsia="pt-BR"/>
+        </w:rPr>
+        <w:t>sorted</w:t>
+      </w:r>
+      <w:proofErr w:type="spellEnd"/>
+      <w:r>
+        <w:rPr>
+          <w:color w:val="EE0000"/>
+          <w:lang w:eastAsia="pt-BR"/>
+        </w:rPr>
+        <w:t>(</w:t>
+      </w:r>
+      <w:proofErr w:type="gramEnd"/>
+      <w:r>
+        <w:rPr>
+          <w:color w:val="EE0000"/>
+          <w:lang w:eastAsia="pt-BR"/>
+        </w:rPr>
+        <w:t>17)</w:t>
+      </w:r>
+    </w:p>
+    <w:p>
+      <w:pPr>
+        <w:rPr>
+          <w:color w:val="EE0000"/>
+          <w:lang w:eastAsia="pt-BR"/>
+        </w:rPr>
+      </w:pPr>
+      <w:proofErr w:type="spellStart"/>
+      <w:proofErr w:type="gramStart"/>
+      <w:r>
+        <w:rPr>
+          <w:color w:val="EE0000"/>
+          <w:lang w:eastAsia="pt-BR"/>
+        </w:rPr>
+        <w:t>lista.insert</w:t>
+      </w:r>
+      <w:proofErr w:type="gramEnd"/>
+      <w:r>
+        <w:rPr>
+          <w:color w:val="EE0000"/>
+          <w:lang w:eastAsia="pt-BR"/>
+        </w:rPr>
+        <w:t>_</w:t>
+      </w:r>
+      <w:proofErr w:type="gramStart"/>
+      <w:r>
+        <w:rPr>
+          <w:color w:val="EE0000"/>
+          <w:lang w:eastAsia="pt-BR"/>
+        </w:rPr>
+        <w:t>sorted</w:t>
+      </w:r>
+      <w:proofErr w:type="spellEnd"/>
+      <w:r>
+        <w:rPr>
+          <w:color w:val="EE0000"/>
+          <w:lang w:eastAsia="pt-BR"/>
+        </w:rPr>
+        <w:t>(</w:t>
+      </w:r>
+      <w:proofErr w:type="gramEnd"/>
+      <w:r>
+        <w:rPr>
+          <w:color w:val="EE0000"/>
+          <w:lang w:eastAsia="pt-BR"/>
+        </w:rPr>
+        <w:t>77)</w:t>
+      </w:r>
+    </w:p>
+    <w:p>
+      <w:pPr>
+        <w:rPr>
+          <w:color w:val="EE0000"/>
+          <w:lang w:eastAsia="pt-BR"/>
+        </w:rPr>
+      </w:pPr>
+      <w:proofErr w:type="spellStart"/>
+      <w:proofErr w:type="gramStart"/>
+      <w:r>
+        <w:rPr>
+          <w:color w:val="EE0000"/>
+          <w:lang w:eastAsia="pt-BR"/>
+        </w:rPr>
+        <w:t>lista.insert</w:t>
+      </w:r>
+      <w:proofErr w:type="gramEnd"/>
+      <w:r>
+        <w:rPr>
+          <w:color w:val="EE0000"/>
+          <w:lang w:eastAsia="pt-BR"/>
+        </w:rPr>
+        <w:t>_</w:t>
+      </w:r>
+      <w:proofErr w:type="gramStart"/>
+      <w:r>
+        <w:rPr>
+          <w:color w:val="EE0000"/>
+          <w:lang w:eastAsia="pt-BR"/>
+        </w:rPr>
+        <w:t>sorted</w:t>
+      </w:r>
+      <w:proofErr w:type="spellEnd"/>
+      <w:r>
+        <w:rPr>
+          <w:color w:val="EE0000"/>
+          <w:lang w:eastAsia="pt-BR"/>
+        </w:rPr>
+        <w:t>(</w:t>
+      </w:r>
+      <w:proofErr w:type="gramEnd"/>
+      <w:r>
+        <w:rPr>
+          <w:color w:val="EE0000"/>
+          <w:lang w:eastAsia="pt-BR"/>
+        </w:rPr>
+        <w:t>31)</w:t>
+      </w:r>
+    </w:p>
+    <w:p>
+      <w:pPr>
+        <w:rPr>
+          <w:color w:val="EE0000"/>
+          <w:lang w:eastAsia="pt-BR"/>
+        </w:rPr>
+      </w:pPr>
+      <w:proofErr w:type="spellStart"/>
+      <w:r>
+        <w:rPr>
+          <w:color w:val="EE0000"/>
+          <w:lang w:eastAsia="pt-BR"/>
+        </w:rPr>
+        <w:t>lista.print_</w:t>
+      </w:r>
+      <w:proofErr w:type="gramStart"/>
+      <w:r>
+        <w:rPr>
+          <w:color w:val="EE0000"/>
+          <w:lang w:eastAsia="pt-BR"/>
+        </w:rPr>
+        <w:t>list</w:t>
+      </w:r>
+      <w:proofErr w:type="spellEnd"/>
+      <w:r>
+        <w:rPr>
+          <w:color w:val="EE0000"/>
+          <w:lang w:eastAsia="pt-BR"/>
+        </w:rPr>
+        <w:t>()  #</w:t>
+      </w:r>
+      <w:proofErr w:type="gramEnd"/>
+      <w:r>
+        <w:rPr>
+          <w:color w:val="EE0000"/>
+          <w:lang w:eastAsia="pt-BR"/>
+        </w:rPr>
+        <w:t xml:space="preserve"> saída esperada: 17 -&gt; 26 -&gt; 31 -&gt; 54 -&gt; 77 -&gt; 93</w:t>
+      </w:r>
+    </w:p>
+    <w:p>
+      <w:pPr>
+        <w:rPr>
+          <w:color w:val="EE0000"/>
+        </w:rPr>
+      </w:pPr>
+    </w:p>
+    <w:p>
+      <w:pPr>
+        <w:rPr>
+          <w:color w:val="EE0000"/>
+        </w:rPr>
+      </w:pPr>
+    </w:p>
+    <w:p>
+      <w:pPr>
+        <w:rPr>
+          <w:b/>
+          <w:bCs/>
+          <w:sz w:val="32"/>
+          <w:szCs w:val="32"/>
+        </w:rPr>
+      </w:pPr>
+      <w:r>
+        <w:rPr>
+          <w:b/>
+          <w:bCs/>
+          <w:sz w:val="32"/>
+          <w:szCs w:val="32"/>
+        </w:rPr>
+        <w:lastRenderedPageBreak/>
+        <w:t>Exercício 2: Remover duplicatas de uma lista encadeada</w:t>
+      </w:r>
+    </w:p>
+    <w:p>
+      <w:r>
+        <w:rPr>
+          <w:b/>
+          <w:bCs/>
+        </w:rPr>
+        <w:t>Objetivo:</w:t>
+      </w:r>
+      <w:r>
+        <w:t xml:space="preserve"> Criar um método que percorra a lista encadeada e elimine valores repetidos, mantendo apenas uma ocorrência de cada.</w:t>
+      </w:r>
+    </w:p>
+    <w:p>
+      <w:r>
+        <w:t>Requisitos:</w:t>
+      </w:r>
+    </w:p>
+    <w:p>
+      <w:pPr>
+        <w:numPr>
+          <w:ilvl w:val="0"/>
+          <w:numId w:val="7"/>
+        </w:numPr>
+      </w:pPr>
+      <w:r>
+        <w:t xml:space="preserve">Implemente a estrutura Node e </w:t>
+      </w:r>
+      <w:proofErr w:type="spellStart"/>
+      <w:r>
+        <w:t>LinkedList</w:t>
+      </w:r>
+      <w:proofErr w:type="spellEnd"/>
+      <w:r>
+        <w:t>.</w:t>
+      </w:r>
+    </w:p>
+    <w:p>
+      <w:pPr>
+        <w:numPr>
+          <w:ilvl w:val="0"/>
+          <w:numId w:val="7"/>
+        </w:numPr>
+      </w:pPr>
+      <w:r>
+        <w:t xml:space="preserve">Crie um método </w:t>
+      </w:r>
+      <w:proofErr w:type="spellStart"/>
+      <w:r>
+        <w:t>remove_</w:t>
+      </w:r>
+      <w:proofErr w:type="gramStart"/>
+      <w:r>
+        <w:t>duplicates</w:t>
+      </w:r>
+      <w:proofErr w:type="spellEnd"/>
+      <w:r>
+        <w:t>(</w:t>
+      </w:r>
+      <w:proofErr w:type="gramEnd"/>
+      <w:r>
+        <w:t>) que percorra a lista e elimina nós duplicados.</w:t>
+      </w:r>
+    </w:p>
+    <w:p>
+      <w:pPr>
+        <w:numPr>
+          <w:ilvl w:val="0"/>
+          <w:numId w:val="7"/>
+        </w:numPr>
+      </w:pPr>
+      <w:r>
+        <w:t>Crie um método para imprimir todos os elementos da lista.</w:t>
+      </w:r>
+    </w:p>
+    <w:p>
+      <w:pPr>
+        <w:rPr>
+          <w:color w:val="EE0000"/>
+        </w:rPr>
+      </w:pPr>
+    </w:p>
+    <w:p>
+      <w:pPr>
+        <w:rPr>
+          <w:color w:val="EE0000"/>
+        </w:rPr>
+      </w:pPr>
+    </w:p>
+    <w:p>
+      <w:pPr>
+        <w:spacing w:after="0"/>
+        <w:rPr>
+          <w:color w:val="EE0000"/>
+        </w:rPr>
+      </w:pPr>
+      <w:proofErr w:type="spellStart"/>
+      <w:r>
+        <w:rPr>
+          <w:color w:val="EE0000"/>
+        </w:rPr>
+        <w:t>class</w:t>
+      </w:r>
+      <w:proofErr w:type="spellEnd"/>
+      <w:r>
+        <w:rPr>
+          <w:color w:val="EE0000"/>
+        </w:rPr>
+        <w:t xml:space="preserve"> Node:</w:t>
+      </w:r>
+    </w:p>
+    <w:p>
+      <w:pPr>
+        <w:spacing w:after="0"/>
+        <w:rPr>
+          <w:color w:val="EE0000"/>
+        </w:rPr>
+      </w:pPr>
+      <w:r>
+        <w:rPr>
+          <w:color w:val="EE0000"/>
+        </w:rPr>
+        <w:t xml:space="preserve">    </w:t>
+      </w:r>
+      <w:proofErr w:type="spellStart"/>
+      <w:r>
+        <w:rPr>
+          <w:color w:val="EE0000"/>
+        </w:rPr>
+        <w:t>def</w:t>
+      </w:r>
+      <w:proofErr w:type="spellEnd"/>
+      <w:r>
+        <w:rPr>
+          <w:color w:val="EE0000"/>
+        </w:rPr>
+        <w:t xml:space="preserve"> __</w:t>
+      </w:r>
+      <w:proofErr w:type="spellStart"/>
+      <w:r>
+        <w:rPr>
+          <w:color w:val="EE0000"/>
+        </w:rPr>
+        <w:t>init</w:t>
+      </w:r>
+      <w:proofErr w:type="spellEnd"/>
+      <w:r>
+        <w:rPr>
+          <w:color w:val="EE0000"/>
+        </w:rPr>
+        <w:t>_</w:t>
+      </w:r>
+      <w:proofErr w:type="gramStart"/>
+      <w:r>
+        <w:rPr>
+          <w:color w:val="EE0000"/>
+        </w:rPr>
+        <w:t>_(</w:t>
+      </w:r>
+      <w:proofErr w:type="gramEnd"/>
+      <w:r>
+        <w:rPr>
+          <w:i/>
+          <w:iCs/>
+          <w:color w:val="EE0000"/>
+        </w:rPr>
+        <w:t>self</w:t>
+      </w:r>
+      <w:r>
+        <w:rPr>
+          <w:color w:val="EE0000"/>
+        </w:rPr>
+        <w:t xml:space="preserve">, </w:t>
+      </w:r>
+      <w:r>
+        <w:rPr>
+          <w:i/>
+          <w:iCs/>
+          <w:color w:val="EE0000"/>
+        </w:rPr>
+        <w:t>data</w:t>
+      </w:r>
+      <w:r>
+        <w:rPr>
+          <w:color w:val="EE0000"/>
+        </w:rPr>
+        <w:t>):</w:t>
+      </w:r>
+    </w:p>
+    <w:p>
+      <w:pPr>
+        <w:spacing w:after="0"/>
+        <w:rPr>
+          <w:color w:val="EE0000"/>
+        </w:rPr>
+      </w:pPr>
+      <w:r>
+        <w:rPr>
+          <w:color w:val="EE0000"/>
+        </w:rPr>
+        <w:t xml:space="preserve">        </w:t>
+      </w:r>
+      <w:proofErr w:type="spellStart"/>
+      <w:r>
+        <w:rPr>
+          <w:i/>
+          <w:iCs/>
+          <w:color w:val="EE0000"/>
+        </w:rPr>
+        <w:t>self</w:t>
+      </w:r>
+      <w:r>
+        <w:rPr>
+          <w:color w:val="EE0000"/>
+        </w:rPr>
+        <w:t>.data</w:t>
+      </w:r>
+      <w:proofErr w:type="spellEnd"/>
+      <w:r>
+        <w:rPr>
+          <w:color w:val="EE0000"/>
+        </w:rPr>
+        <w:t xml:space="preserve"> = </w:t>
+      </w:r>
+      <w:r>
+        <w:rPr>
+          <w:i/>
+          <w:iCs/>
+          <w:color w:val="EE0000"/>
+        </w:rPr>
+        <w:t>data</w:t>
+      </w:r>
+    </w:p>
+    <w:p>
+      <w:pPr>
+        <w:spacing w:after="0"/>
+        <w:rPr>
+          <w:color w:val="EE0000"/>
+        </w:rPr>
+      </w:pPr>
+      <w:r>
+        <w:rPr>
+          <w:color w:val="EE0000"/>
+        </w:rPr>
+        <w:t xml:space="preserve">        </w:t>
+      </w:r>
+      <w:proofErr w:type="spellStart"/>
+      <w:proofErr w:type="gramStart"/>
+      <w:r>
+        <w:rPr>
+          <w:i/>
+          <w:iCs/>
+          <w:color w:val="EE0000"/>
+        </w:rPr>
+        <w:t>self</w:t>
+      </w:r>
+      <w:r>
+        <w:rPr>
+          <w:color w:val="EE0000"/>
+        </w:rPr>
+        <w:t>.next</w:t>
+      </w:r>
+      <w:proofErr w:type="spellEnd"/>
+      <w:proofErr w:type="gramEnd"/>
+      <w:r>
+        <w:rPr>
+          <w:color w:val="EE0000"/>
+        </w:rPr>
+        <w:t xml:space="preserve"> = </w:t>
+      </w:r>
+      <w:proofErr w:type="spellStart"/>
+      <w:r>
+        <w:rPr>
+          <w:color w:val="EE0000"/>
+        </w:rPr>
+        <w:t>None</w:t>
+      </w:r>
+      <w:proofErr w:type="spellEnd"/>
+    </w:p>
+    <w:p>
+      <w:pPr>
+        <w:spacing w:after="0"/>
+        <w:rPr>
+          <w:color w:val="EE0000"/>
+        </w:rPr>
+      </w:pPr>
+    </w:p>
+    <w:p>
+      <w:pPr>
+        <w:spacing w:after="0"/>
+        <w:rPr>
+          <w:color w:val="EE0000"/>
+        </w:rPr>
+      </w:pPr>
+      <w:proofErr w:type="spellStart"/>
+      <w:r>
+        <w:rPr>
+          <w:color w:val="EE0000"/>
+        </w:rPr>
+        <w:t>class</w:t>
+      </w:r>
+      <w:proofErr w:type="spellEnd"/>
+      <w:r>
+        <w:rPr>
+          <w:color w:val="EE0000"/>
+        </w:rPr>
+        <w:t xml:space="preserve"> </w:t>
+      </w:r>
+      <w:proofErr w:type="spellStart"/>
+      <w:r>
+        <w:rPr>
+          <w:color w:val="EE0000"/>
+        </w:rPr>
+        <w:t>LinkedList</w:t>
+      </w:r>
+      <w:proofErr w:type="spellEnd"/>
+      <w:r>
+        <w:rPr>
+          <w:color w:val="EE0000"/>
+        </w:rPr>
+        <w:t>:</w:t>
+      </w:r>
+    </w:p>
+    <w:p>
+      <w:pPr>
+        <w:spacing w:after="0"/>
+        <w:rPr>
+          <w:color w:val="EE0000"/>
+        </w:rPr>
+      </w:pPr>
+      <w:r>
+        <w:rPr>
+          <w:color w:val="EE0000"/>
+        </w:rPr>
+        <w:t xml:space="preserve">    </w:t>
+      </w:r>
+      <w:proofErr w:type="spellStart"/>
+      <w:r>
+        <w:rPr>
+          <w:color w:val="EE0000"/>
+        </w:rPr>
+        <w:t>def</w:t>
+      </w:r>
+      <w:proofErr w:type="spellEnd"/>
+      <w:r>
+        <w:rPr>
+          <w:color w:val="EE0000"/>
+        </w:rPr>
+        <w:t xml:space="preserve"> __</w:t>
+      </w:r>
+      <w:proofErr w:type="spellStart"/>
+      <w:r>
+        <w:rPr>
+          <w:color w:val="EE0000"/>
+        </w:rPr>
+        <w:t>init</w:t>
+      </w:r>
+      <w:proofErr w:type="spellEnd"/>
+      <w:r>
+        <w:rPr>
+          <w:color w:val="EE0000"/>
+        </w:rPr>
+        <w:t>__(</w:t>
+      </w:r>
+      <w:r>
+        <w:rPr>
+          <w:i/>
+          <w:iCs/>
+          <w:color w:val="EE0000"/>
+        </w:rPr>
+        <w:t>self</w:t>
+      </w:r>
+      <w:r>
+        <w:rPr>
+          <w:color w:val="EE0000"/>
+        </w:rPr>
+        <w:t>):</w:t>
+      </w:r>
+    </w:p>
+    <w:p>
+      <w:pPr>
+        <w:spacing w:after="0"/>
+        <w:rPr>
+          <w:color w:val="EE0000"/>
+        </w:rPr>
+      </w:pPr>
+      <w:r>
+        <w:rPr>
+          <w:color w:val="EE0000"/>
+        </w:rPr>
+        <w:t xml:space="preserve">        </w:t>
+      </w:r>
+      <w:proofErr w:type="spellStart"/>
+      <w:proofErr w:type="gramStart"/>
+      <w:r>
+        <w:rPr>
+          <w:i/>
+          <w:iCs/>
+          <w:color w:val="EE0000"/>
+        </w:rPr>
+        <w:t>self</w:t>
+      </w:r>
+      <w:r>
+        <w:rPr>
+          <w:color w:val="EE0000"/>
+        </w:rPr>
+        <w:t>.head</w:t>
+      </w:r>
+      <w:proofErr w:type="spellEnd"/>
+      <w:proofErr w:type="gramEnd"/>
+      <w:r>
+        <w:rPr>
+          <w:color w:val="EE0000"/>
+        </w:rPr>
+        <w:t xml:space="preserve"> = </w:t>
+      </w:r>
+      <w:proofErr w:type="spellStart"/>
+      <w:r>
+        <w:rPr>
+          <w:color w:val="EE0000"/>
+        </w:rPr>
+        <w:t>None</w:t>
+      </w:r>
+      <w:proofErr w:type="spellEnd"/>
+    </w:p>
+    <w:p>
+      <w:pPr>
+        <w:spacing w:after="0"/>
+        <w:rPr>
+          <w:color w:val="EE0000"/>
+        </w:rPr>
+      </w:pPr>
+    </w:p>
+    <w:p>
+      <w:pPr>
+        <w:spacing w:after="0"/>
+        <w:rPr>
+          <w:color w:val="EE0000"/>
+        </w:rPr>
+      </w:pPr>
+      <w:r>
+        <w:rPr>
+          <w:color w:val="EE0000"/>
+        </w:rPr>
+        <w:t xml:space="preserve">    </w:t>
+      </w:r>
+      <w:proofErr w:type="spellStart"/>
+      <w:r>
+        <w:rPr>
+          <w:color w:val="EE0000"/>
+        </w:rPr>
+        <w:t>def</w:t>
+      </w:r>
+      <w:proofErr w:type="spellEnd"/>
+      <w:r>
+        <w:rPr>
+          <w:color w:val="EE0000"/>
+        </w:rPr>
+        <w:t xml:space="preserve"> </w:t>
+      </w:r>
+      <w:proofErr w:type="spellStart"/>
+      <w:proofErr w:type="gramStart"/>
+      <w:r>
+        <w:rPr>
+          <w:color w:val="EE0000"/>
+        </w:rPr>
+        <w:t>append</w:t>
+      </w:r>
+      <w:proofErr w:type="spellEnd"/>
+      <w:r>
+        <w:rPr>
+          <w:color w:val="EE0000"/>
+        </w:rPr>
+        <w:t>(</w:t>
+      </w:r>
+      <w:proofErr w:type="gramEnd"/>
+      <w:r>
+        <w:rPr>
+          <w:i/>
+          <w:iCs/>
+          <w:color w:val="EE0000"/>
+        </w:rPr>
+        <w:t>self</w:t>
+      </w:r>
+      <w:r>
+        <w:rPr>
+          <w:color w:val="EE0000"/>
+        </w:rPr>
+        <w:t xml:space="preserve">, </w:t>
+      </w:r>
+      <w:r>
+        <w:rPr>
+          <w:i/>
+          <w:iCs/>
+          <w:color w:val="EE0000"/>
+        </w:rPr>
+        <w:t>data</w:t>
+      </w:r>
+      <w:r>
+        <w:rPr>
+          <w:color w:val="EE0000"/>
+        </w:rPr>
+        <w:t>):</w:t>
+      </w:r>
+    </w:p>
+    <w:p>
+      <w:pPr>
+        <w:spacing w:after="0"/>
+        <w:rPr>
+          <w:color w:val="EE0000"/>
+        </w:rPr>
+      </w:pPr>
+      <w:r>
+        <w:rPr>
+          <w:color w:val="EE0000"/>
+        </w:rPr>
+        <w:t xml:space="preserve">        </w:t>
+      </w:r>
+      <w:proofErr w:type="spellStart"/>
+      <w:r>
+        <w:rPr>
+          <w:color w:val="EE0000"/>
+        </w:rPr>
+        <w:t>new_node</w:t>
+      </w:r>
+      <w:proofErr w:type="spellEnd"/>
+      <w:r>
+        <w:rPr>
+          <w:color w:val="EE0000"/>
+        </w:rPr>
+        <w:t xml:space="preserve"> = Node(</w:t>
+      </w:r>
+      <w:r>
+        <w:rPr>
+          <w:i/>
+          <w:iCs/>
+          <w:color w:val="EE0000"/>
+        </w:rPr>
+        <w:t>data</w:t>
+      </w:r>
+      <w:r>
+        <w:rPr>
+          <w:color w:val="EE0000"/>
+        </w:rPr>
+        <w:t>)</w:t>
+      </w:r>
+    </w:p>
+    <w:p>
+      <w:pPr>
+        <w:spacing w:after="0"/>
+        <w:rPr>
+          <w:color w:val="EE0000"/>
+        </w:rPr>
+      </w:pPr>
+      <w:r>
+        <w:rPr>
+          <w:color w:val="EE0000"/>
+        </w:rPr>
+        <w:t xml:space="preserve">        </w:t>
+      </w:r>
+      <w:proofErr w:type="spellStart"/>
+      <w:r>
+        <w:rPr>
+          <w:color w:val="EE0000"/>
+        </w:rPr>
+        <w:t>if</w:t>
+      </w:r>
+      <w:proofErr w:type="spellEnd"/>
+      <w:r>
+        <w:rPr>
+          <w:color w:val="EE0000"/>
+        </w:rPr>
+        <w:t xml:space="preserve"> </w:t>
+      </w:r>
+      <w:proofErr w:type="spellStart"/>
+      <w:proofErr w:type="gramStart"/>
+      <w:r>
+        <w:rPr>
+          <w:i/>
+          <w:iCs/>
+          <w:color w:val="EE0000"/>
+        </w:rPr>
+        <w:t>self</w:t>
+      </w:r>
+      <w:r>
+        <w:rPr>
+          <w:color w:val="EE0000"/>
+        </w:rPr>
+        <w:t>.head</w:t>
+      </w:r>
+      <w:proofErr w:type="spellEnd"/>
+      <w:proofErr w:type="gramEnd"/>
+      <w:r>
+        <w:rPr>
+          <w:color w:val="EE0000"/>
+        </w:rPr>
+        <w:t xml:space="preserve"> </w:t>
+      </w:r>
+      <w:proofErr w:type="spellStart"/>
+      <w:r>
+        <w:rPr>
+          <w:color w:val="EE0000"/>
+        </w:rPr>
+        <w:t>is</w:t>
+      </w:r>
+      <w:proofErr w:type="spellEnd"/>
+      <w:r>
+        <w:rPr>
+          <w:color w:val="EE0000"/>
+        </w:rPr>
+        <w:t xml:space="preserve"> </w:t>
+      </w:r>
+      <w:proofErr w:type="spellStart"/>
+      <w:r>
+        <w:rPr>
+          <w:color w:val="EE0000"/>
+        </w:rPr>
+        <w:t>None</w:t>
+      </w:r>
+      <w:proofErr w:type="spellEnd"/>
+      <w:r>
+        <w:rPr>
+          <w:color w:val="EE0000"/>
+        </w:rPr>
+        <w:t>:</w:t>
+      </w:r>
+    </w:p>
+    <w:p>
+      <w:pPr>
+        <w:spacing w:after="0"/>
+        <w:rPr>
+          <w:color w:val="EE0000"/>
+        </w:rPr>
+      </w:pPr>
+      <w:r>
+        <w:rPr>
+          <w:color w:val="EE0000"/>
+        </w:rPr>
+        <w:t xml:space="preserve">            </w:t>
+      </w:r>
+      <w:proofErr w:type="spellStart"/>
+      <w:proofErr w:type="gramStart"/>
+      <w:r>
+        <w:rPr>
+          <w:i/>
+          <w:iCs/>
+          <w:color w:val="EE0000"/>
+        </w:rPr>
+        <w:t>self</w:t>
+      </w:r>
+      <w:r>
+        <w:rPr>
+          <w:color w:val="EE0000"/>
+        </w:rPr>
+        <w:t>.head</w:t>
+      </w:r>
+      <w:proofErr w:type="spellEnd"/>
+      <w:proofErr w:type="gramEnd"/>
+      <w:r>
+        <w:rPr>
+          <w:color w:val="EE0000"/>
+        </w:rPr>
+        <w:t xml:space="preserve"> = </w:t>
+      </w:r>
+      <w:proofErr w:type="spellStart"/>
+      <w:r>
+        <w:rPr>
+          <w:color w:val="EE0000"/>
+        </w:rPr>
+        <w:t>new_node</w:t>
+      </w:r>
+      <w:proofErr w:type="spellEnd"/>
+    </w:p>
+    <w:p>
+      <w:pPr>
+        <w:spacing w:after="0"/>
+        <w:rPr>
+          <w:color w:val="EE0000"/>
+        </w:rPr>
+      </w:pPr>
+      <w:r>
+        <w:rPr>
+          <w:color w:val="EE0000"/>
+        </w:rPr>
+        <w:t xml:space="preserve">            </w:t>
+      </w:r>
+      <w:proofErr w:type="spellStart"/>
+      <w:r>
+        <w:rPr>
+          <w:color w:val="EE0000"/>
+        </w:rPr>
+        <w:t>return</w:t>
+      </w:r>
+      <w:proofErr w:type="spellEnd"/>
+    </w:p>
+    <w:p>
+      <w:pPr>
+        <w:spacing w:after="0"/>
+        <w:rPr>
+          <w:color w:val="EE0000"/>
+        </w:rPr>
+      </w:pPr>
+      <w:r>
+        <w:rPr>
+          <w:color w:val="EE0000"/>
+        </w:rPr>
+        <w:t xml:space="preserve">        </w:t>
+      </w:r>
+      <w:proofErr w:type="spellStart"/>
+      <w:r>
+        <w:rPr>
+          <w:color w:val="EE0000"/>
+        </w:rPr>
+        <w:t>current</w:t>
+      </w:r>
+      <w:proofErr w:type="spellEnd"/>
+      <w:r>
+        <w:rPr>
+          <w:color w:val="EE0000"/>
+        </w:rPr>
+        <w:t xml:space="preserve"> = </w:t>
+      </w:r>
+      <w:proofErr w:type="spellStart"/>
+      <w:proofErr w:type="gramStart"/>
+      <w:r>
+        <w:rPr>
+          <w:i/>
+          <w:iCs/>
+          <w:color w:val="EE0000"/>
+        </w:rPr>
+        <w:t>self</w:t>
+      </w:r>
+      <w:r>
+        <w:rPr>
+          <w:color w:val="EE0000"/>
+        </w:rPr>
+        <w:t>.head</w:t>
+      </w:r>
+      <w:proofErr w:type="spellEnd"/>
+      <w:proofErr w:type="gramEnd"/>
+    </w:p>
+    <w:p>
+      <w:pPr>
+        <w:spacing w:after="0"/>
+        <w:rPr>
+          <w:color w:val="EE0000"/>
+        </w:rPr>
+      </w:pPr>
+      <w:r>
+        <w:rPr>
+          <w:color w:val="EE0000"/>
+        </w:rPr>
+        <w:t xml:space="preserve">        </w:t>
+      </w:r>
+      <w:proofErr w:type="spellStart"/>
+      <w:r>
+        <w:rPr>
+          <w:color w:val="EE0000"/>
+        </w:rPr>
+        <w:t>while</w:t>
+      </w:r>
+      <w:proofErr w:type="spellEnd"/>
+      <w:r>
+        <w:rPr>
+          <w:color w:val="EE0000"/>
+        </w:rPr>
+        <w:t xml:space="preserve"> </w:t>
+      </w:r>
+      <w:proofErr w:type="spellStart"/>
+      <w:proofErr w:type="gramStart"/>
+      <w:r>
+        <w:rPr>
+          <w:color w:val="EE0000"/>
+        </w:rPr>
+        <w:t>current.next</w:t>
+      </w:r>
+      <w:proofErr w:type="spellEnd"/>
+      <w:proofErr w:type="gramEnd"/>
+      <w:r>
+        <w:rPr>
+          <w:color w:val="EE0000"/>
+        </w:rPr>
+        <w:t>:</w:t>
+      </w:r>
+    </w:p>
+    <w:p>
+      <w:pPr>
+        <w:spacing w:after="0"/>
+        <w:rPr>
+          <w:color w:val="EE0000"/>
+        </w:rPr>
+      </w:pPr>
+      <w:r>
+        <w:rPr>
+          <w:color w:val="EE0000"/>
+        </w:rPr>
+        <w:t xml:space="preserve">            </w:t>
+      </w:r>
+      <w:proofErr w:type="spellStart"/>
+      <w:r>
+        <w:rPr>
+          <w:color w:val="EE0000"/>
+        </w:rPr>
+        <w:t>current</w:t>
+      </w:r>
+      <w:proofErr w:type="spellEnd"/>
+      <w:r>
+        <w:rPr>
+          <w:color w:val="EE0000"/>
+        </w:rPr>
+        <w:t xml:space="preserve"> = </w:t>
+      </w:r>
+      <w:proofErr w:type="spellStart"/>
+      <w:proofErr w:type="gramStart"/>
+      <w:r>
+        <w:rPr>
+          <w:color w:val="EE0000"/>
+        </w:rPr>
+        <w:t>current.next</w:t>
+      </w:r>
+      <w:proofErr w:type="spellEnd"/>
+      <w:proofErr w:type="gramEnd"/>
+    </w:p>
+    <w:p>
+      <w:pPr>
+        <w:spacing w:after="0"/>
+        <w:rPr>
+          <w:color w:val="EE0000"/>
+        </w:rPr>
+      </w:pPr>
+      <w:r>
+        <w:rPr>
+          <w:color w:val="EE0000"/>
+        </w:rPr>
+        <w:t xml:space="preserve">        </w:t>
+      </w:r>
+      <w:proofErr w:type="spellStart"/>
+      <w:proofErr w:type="gramStart"/>
+      <w:r>
+        <w:rPr>
+          <w:color w:val="EE0000"/>
+        </w:rPr>
+        <w:t>current.next</w:t>
+      </w:r>
+      <w:proofErr w:type="spellEnd"/>
+      <w:proofErr w:type="gramEnd"/>
+      <w:r>
+        <w:rPr>
+          <w:color w:val="EE0000"/>
+        </w:rPr>
+        <w:t xml:space="preserve"> = </w:t>
+      </w:r>
+      <w:proofErr w:type="spellStart"/>
+      <w:r>
+        <w:rPr>
+          <w:color w:val="EE0000"/>
+        </w:rPr>
+        <w:t>new_node</w:t>
+      </w:r>
+      <w:proofErr w:type="spellEnd"/>
+    </w:p>
+    <w:p>
+      <w:pPr>
+        <w:spacing w:after="0"/>
+        <w:rPr>
+          <w:color w:val="EE0000"/>
+        </w:rPr>
+      </w:pPr>
+    </w:p>
+    <w:p>
+      <w:pPr>
+        <w:spacing w:after="0"/>
+        <w:rPr>
+          <w:color w:val="EE0000"/>
+        </w:rPr>
+      </w:pPr>
+      <w:r>
+        <w:rPr>
+          <w:color w:val="EE0000"/>
+        </w:rPr>
+        <w:t xml:space="preserve">    </w:t>
+      </w:r>
+      <w:proofErr w:type="spellStart"/>
+      <w:r>
+        <w:rPr>
+          <w:color w:val="EE0000"/>
+        </w:rPr>
+        <w:t>def</w:t>
+      </w:r>
+      <w:proofErr w:type="spellEnd"/>
+      <w:r>
+        <w:rPr>
+          <w:color w:val="EE0000"/>
+        </w:rPr>
+        <w:t xml:space="preserve"> </w:t>
+      </w:r>
+      <w:proofErr w:type="spellStart"/>
+      <w:r>
+        <w:rPr>
+          <w:color w:val="EE0000"/>
+        </w:rPr>
+        <w:t>print_list</w:t>
+      </w:r>
+      <w:proofErr w:type="spellEnd"/>
+      <w:r>
+        <w:rPr>
+          <w:color w:val="EE0000"/>
+        </w:rPr>
+        <w:t>(</w:t>
+      </w:r>
+      <w:r>
+        <w:rPr>
+          <w:i/>
+          <w:iCs/>
+          <w:color w:val="EE0000"/>
+        </w:rPr>
+        <w:t>self</w:t>
+      </w:r>
+      <w:r>
+        <w:rPr>
+          <w:color w:val="EE0000"/>
+        </w:rPr>
+        <w:t>):</w:t>
+      </w:r>
+    </w:p>
+    <w:p>
+      <w:pPr>
+        <w:spacing w:after="0"/>
+        <w:rPr>
+          <w:color w:val="EE0000"/>
+        </w:rPr>
+      </w:pPr>
+      <w:r>
+        <w:rPr>
+          <w:color w:val="EE0000"/>
+        </w:rPr>
+        <w:t xml:space="preserve">        </w:t>
+      </w:r>
+      <w:proofErr w:type="spellStart"/>
+      <w:r>
+        <w:rPr>
+          <w:color w:val="EE0000"/>
+        </w:rPr>
+        <w:t>current</w:t>
+      </w:r>
+      <w:proofErr w:type="spellEnd"/>
+      <w:r>
+        <w:rPr>
+          <w:color w:val="EE0000"/>
+        </w:rPr>
+        <w:t xml:space="preserve"> = </w:t>
+      </w:r>
+      <w:proofErr w:type="spellStart"/>
+      <w:proofErr w:type="gramStart"/>
+      <w:r>
+        <w:rPr>
+          <w:i/>
+          <w:iCs/>
+          <w:color w:val="EE0000"/>
+        </w:rPr>
+        <w:t>self</w:t>
+      </w:r>
+      <w:r>
+        <w:rPr>
+          <w:color w:val="EE0000"/>
+        </w:rPr>
+        <w:t>.head</w:t>
+      </w:r>
+      <w:proofErr w:type="spellEnd"/>
+      <w:proofErr w:type="gramEnd"/>
+    </w:p>
+    <w:p>
+      <w:pPr>
+        <w:spacing w:after="0"/>
+        <w:rPr>
+          <w:color w:val="EE0000"/>
+        </w:rPr>
+      </w:pPr>
+      <w:r>
+        <w:rPr>
+          <w:color w:val="EE0000"/>
+        </w:rPr>
+        <w:t xml:space="preserve">        </w:t>
+      </w:r>
+      <w:proofErr w:type="spellStart"/>
+      <w:r>
+        <w:rPr>
+          <w:color w:val="EE0000"/>
+        </w:rPr>
+        <w:t>while</w:t>
+      </w:r>
+      <w:proofErr w:type="spellEnd"/>
+      <w:r>
+        <w:rPr>
+          <w:color w:val="EE0000"/>
+        </w:rPr>
+        <w:t xml:space="preserve"> </w:t>
+      </w:r>
+      <w:proofErr w:type="spellStart"/>
+      <w:r>
+        <w:rPr>
+          <w:color w:val="EE0000"/>
+        </w:rPr>
+        <w:t>current</w:t>
+      </w:r>
+      <w:proofErr w:type="spellEnd"/>
+      <w:r>
+        <w:rPr>
+          <w:color w:val="EE0000"/>
+        </w:rPr>
+        <w:t>:</w:t>
+      </w:r>
+    </w:p>
+    <w:p>
+      <w:pPr>
+        <w:spacing w:after="0"/>
+        <w:rPr>
+          <w:color w:val="EE0000"/>
+        </w:rPr>
+      </w:pPr>
+      <w:r>
+        <w:rPr>
+          <w:color w:val="EE0000"/>
+        </w:rPr>
+        <w:t xml:space="preserve">            </w:t>
+      </w:r>
+      <w:proofErr w:type="gramStart"/>
+      <w:r>
+        <w:rPr>
+          <w:color w:val="EE0000"/>
+        </w:rPr>
+        <w:t>print(</w:t>
+      </w:r>
+      <w:proofErr w:type="spellStart"/>
+      <w:proofErr w:type="gramEnd"/>
+      <w:r>
+        <w:rPr>
+          <w:color w:val="EE0000"/>
+        </w:rPr>
+        <w:t>current.data</w:t>
+      </w:r>
+      <w:proofErr w:type="spellEnd"/>
+      <w:r>
+        <w:rPr>
+          <w:color w:val="EE0000"/>
+        </w:rPr>
+        <w:t xml:space="preserve">, </w:t>
+      </w:r>
+      <w:proofErr w:type="spellStart"/>
+      <w:r>
+        <w:rPr>
+          <w:i/>
+          <w:iCs/>
+          <w:color w:val="EE0000"/>
+        </w:rPr>
+        <w:t>end</w:t>
+      </w:r>
+      <w:proofErr w:type="spellEnd"/>
+      <w:r>
+        <w:rPr>
+          <w:color w:val="EE0000"/>
+        </w:rPr>
+        <w:t>=" -&gt; ")</w:t>
+      </w:r>
+    </w:p>
+    <w:p>
+      <w:pPr>
+        <w:spacing w:after="0"/>
+        <w:rPr>
+          <w:color w:val="EE0000"/>
+        </w:rPr>
+      </w:pPr>
+      <w:r>
+        <w:rPr>
+          <w:color w:val="EE0000"/>
+        </w:rPr>
+        <w:t xml:space="preserve">            </w:t>
+      </w:r>
+      <w:proofErr w:type="spellStart"/>
+      <w:r>
+        <w:rPr>
+          <w:color w:val="EE0000"/>
+        </w:rPr>
+        <w:t>current</w:t>
+      </w:r>
+      <w:proofErr w:type="spellEnd"/>
+      <w:r>
+        <w:rPr>
+          <w:color w:val="EE0000"/>
+        </w:rPr>
+        <w:t xml:space="preserve"> = </w:t>
+      </w:r>
+      <w:proofErr w:type="spellStart"/>
+      <w:proofErr w:type="gramStart"/>
+      <w:r>
+        <w:rPr>
+          <w:color w:val="EE0000"/>
+        </w:rPr>
+        <w:t>current.next</w:t>
+      </w:r>
+      <w:proofErr w:type="spellEnd"/>
+      <w:proofErr w:type="gramEnd"/>
+    </w:p>
+    <w:p>
+      <w:pPr>
+        <w:spacing w:after="0"/>
+        <w:rPr>
+          <w:color w:val="EE0000"/>
+        </w:rPr>
+      </w:pPr>
+      <w:r>
+        <w:rPr>
+          <w:color w:val="EE0000"/>
+        </w:rPr>
+        <w:t>        print("</w:t>
+      </w:r>
+      <w:proofErr w:type="spellStart"/>
+      <w:r>
+        <w:rPr>
+          <w:color w:val="EE0000"/>
+        </w:rPr>
+        <w:t>None</w:t>
+      </w:r>
+      <w:proofErr w:type="spellEnd"/>
+      <w:r>
+        <w:rPr>
+          <w:color w:val="EE0000"/>
+        </w:rPr>
+        <w:t>")</w:t>
+      </w:r>
+    </w:p>
+    <w:p>
+      <w:pPr>
+        <w:spacing w:after="0"/>
+        <w:rPr>
+          <w:color w:val="EE0000"/>
+        </w:rPr>
+      </w:pPr>
+    </w:p>
+    <w:p>
+      <w:pPr>
+        <w:spacing w:after="0"/>
+        <w:rPr>
+          <w:color w:val="EE0000"/>
+        </w:rPr>
+      </w:pPr>
+      <w:r>
+        <w:rPr>
+          <w:color w:val="EE0000"/>
+        </w:rPr>
+        <w:t xml:space="preserve">    </w:t>
+      </w:r>
+      <w:proofErr w:type="spellStart"/>
+      <w:r>
+        <w:rPr>
+          <w:color w:val="EE0000"/>
+        </w:rPr>
+        <w:t>def</w:t>
+      </w:r>
+      <w:proofErr w:type="spellEnd"/>
+      <w:r>
+        <w:rPr>
+          <w:color w:val="EE0000"/>
+        </w:rPr>
+        <w:t xml:space="preserve"> </w:t>
+      </w:r>
+      <w:proofErr w:type="spellStart"/>
+      <w:r>
+        <w:rPr>
+          <w:color w:val="EE0000"/>
+        </w:rPr>
+        <w:t>remove_duplicates</w:t>
+      </w:r>
+      <w:proofErr w:type="spellEnd"/>
+      <w:r>
+        <w:rPr>
+          <w:color w:val="EE0000"/>
+        </w:rPr>
+        <w:t>(</w:t>
+      </w:r>
+      <w:r>
+        <w:rPr>
+          <w:i/>
+          <w:iCs/>
+          <w:color w:val="EE0000"/>
+        </w:rPr>
+        <w:t>self</w:t>
+      </w:r>
+      <w:r>
+        <w:rPr>
+          <w:color w:val="EE0000"/>
+        </w:rPr>
+        <w:t>):</w:t>
+      </w:r>
+    </w:p>
+    <w:p>
+      <w:pPr>
+        <w:spacing w:after="0"/>
+        <w:rPr>
+          <w:color w:val="EE0000"/>
+        </w:rPr>
+      </w:pPr>
+      <w:r>
+        <w:rPr>
+          <w:color w:val="EE0000"/>
+        </w:rPr>
+        <w:lastRenderedPageBreak/>
+        <w:t xml:space="preserve">        </w:t>
+      </w:r>
+      <w:proofErr w:type="spellStart"/>
+      <w:r>
+        <w:rPr>
+          <w:color w:val="EE0000"/>
+        </w:rPr>
+        <w:t>if</w:t>
+      </w:r>
+      <w:proofErr w:type="spellEnd"/>
+      <w:r>
+        <w:rPr>
+          <w:color w:val="EE0000"/>
+        </w:rPr>
+        <w:t xml:space="preserve"> </w:t>
+      </w:r>
+      <w:proofErr w:type="spellStart"/>
+      <w:proofErr w:type="gramStart"/>
+      <w:r>
+        <w:rPr>
+          <w:i/>
+          <w:iCs/>
+          <w:color w:val="EE0000"/>
+        </w:rPr>
+        <w:t>self</w:t>
+      </w:r>
+      <w:r>
+        <w:rPr>
+          <w:color w:val="EE0000"/>
+        </w:rPr>
+        <w:t>.head</w:t>
+      </w:r>
+      <w:proofErr w:type="spellEnd"/>
+      <w:proofErr w:type="gramEnd"/>
+      <w:r>
+        <w:rPr>
+          <w:color w:val="EE0000"/>
+        </w:rPr>
+        <w:t xml:space="preserve"> </w:t>
+      </w:r>
+      <w:proofErr w:type="spellStart"/>
+      <w:r>
+        <w:rPr>
+          <w:color w:val="EE0000"/>
+        </w:rPr>
+        <w:t>is</w:t>
+      </w:r>
+      <w:proofErr w:type="spellEnd"/>
+      <w:r>
+        <w:rPr>
+          <w:color w:val="EE0000"/>
+        </w:rPr>
+        <w:t xml:space="preserve"> </w:t>
+      </w:r>
+      <w:proofErr w:type="spellStart"/>
+      <w:r>
+        <w:rPr>
+          <w:color w:val="EE0000"/>
+        </w:rPr>
+        <w:t>None</w:t>
+      </w:r>
+      <w:proofErr w:type="spellEnd"/>
+      <w:r>
+        <w:rPr>
+          <w:color w:val="EE0000"/>
+        </w:rPr>
+        <w:t>:</w:t>
+      </w:r>
+    </w:p>
+    <w:p>
+      <w:pPr>
+        <w:spacing w:after="0"/>
+        <w:rPr>
+          <w:color w:val="EE0000"/>
+        </w:rPr>
+      </w:pPr>
+      <w:r>
+        <w:rPr>
+          <w:color w:val="EE0000"/>
+        </w:rPr>
+        <w:t xml:space="preserve">            </w:t>
+      </w:r>
+      <w:proofErr w:type="spellStart"/>
+      <w:r>
+        <w:rPr>
+          <w:color w:val="EE0000"/>
+        </w:rPr>
+        <w:t>return</w:t>
+      </w:r>
+      <w:proofErr w:type="spellEnd"/>
+    </w:p>
+    <w:p>
+      <w:pPr>
+        <w:spacing w:after="0"/>
+        <w:rPr>
+          <w:color w:val="EE0000"/>
+        </w:rPr>
+      </w:pPr>
+    </w:p>
+    <w:p>
+      <w:pPr>
+        <w:spacing w:after="0"/>
+        <w:rPr>
+          <w:color w:val="EE0000"/>
+        </w:rPr>
+      </w:pPr>
+      <w:r>
+        <w:rPr>
+          <w:color w:val="EE0000"/>
+        </w:rPr>
+        <w:t xml:space="preserve">        </w:t>
+      </w:r>
+      <w:proofErr w:type="spellStart"/>
+      <w:r>
+        <w:rPr>
+          <w:color w:val="EE0000"/>
+        </w:rPr>
+        <w:t>seen</w:t>
+      </w:r>
+      <w:proofErr w:type="spellEnd"/>
+      <w:r>
+        <w:rPr>
+          <w:color w:val="EE0000"/>
+        </w:rPr>
+        <w:t xml:space="preserve"> = </w:t>
+      </w:r>
+      <w:proofErr w:type="gramStart"/>
+      <w:r>
+        <w:rPr>
+          <w:color w:val="EE0000"/>
+        </w:rPr>
+        <w:t>set(</w:t>
+      </w:r>
+      <w:proofErr w:type="gramEnd"/>
+      <w:r>
+        <w:rPr>
+          <w:color w:val="EE0000"/>
+        </w:rPr>
+        <w:t>)</w:t>
+      </w:r>
+    </w:p>
+    <w:p>
+      <w:pPr>
+        <w:spacing w:after="0"/>
+        <w:rPr>
+          <w:color w:val="EE0000"/>
+        </w:rPr>
+      </w:pPr>
+      <w:r>
+        <w:rPr>
+          <w:color w:val="EE0000"/>
+        </w:rPr>
+        <w:t xml:space="preserve">        </w:t>
+      </w:r>
+      <w:proofErr w:type="spellStart"/>
+      <w:r>
+        <w:rPr>
+          <w:color w:val="EE0000"/>
+        </w:rPr>
+        <w:t>current</w:t>
+      </w:r>
+      <w:proofErr w:type="spellEnd"/>
+      <w:r>
+        <w:rPr>
+          <w:color w:val="EE0000"/>
+        </w:rPr>
+        <w:t xml:space="preserve"> = </w:t>
+      </w:r>
+      <w:proofErr w:type="spellStart"/>
+      <w:proofErr w:type="gramStart"/>
+      <w:r>
+        <w:rPr>
+          <w:i/>
+          <w:iCs/>
+          <w:color w:val="EE0000"/>
+        </w:rPr>
+        <w:t>self</w:t>
+      </w:r>
+      <w:r>
+        <w:rPr>
+          <w:color w:val="EE0000"/>
+        </w:rPr>
+        <w:t>.head</w:t>
+      </w:r>
+      <w:proofErr w:type="spellEnd"/>
+      <w:proofErr w:type="gramEnd"/>
+    </w:p>
+    <w:p>
+      <w:pPr>
+        <w:spacing w:after="0"/>
+        <w:rPr>
+          <w:color w:val="EE0000"/>
+        </w:rPr>
+      </w:pPr>
+      <w:r>
+        <w:rPr>
+          <w:color w:val="EE0000"/>
+        </w:rPr>
+        <w:t xml:space="preserve">        </w:t>
+      </w:r>
+      <w:proofErr w:type="spellStart"/>
+      <w:r>
+        <w:rPr>
+          <w:color w:val="EE0000"/>
+        </w:rPr>
+        <w:t>seen.add</w:t>
+      </w:r>
+      <w:proofErr w:type="spellEnd"/>
+      <w:r>
+        <w:rPr>
+          <w:color w:val="EE0000"/>
+        </w:rPr>
+        <w:t>(</w:t>
+      </w:r>
+      <w:proofErr w:type="spellStart"/>
+      <w:r>
+        <w:rPr>
+          <w:color w:val="EE0000"/>
+        </w:rPr>
+        <w:t>current.data</w:t>
+      </w:r>
+      <w:proofErr w:type="spellEnd"/>
+      <w:r>
+        <w:rPr>
+          <w:color w:val="EE0000"/>
+        </w:rPr>
+        <w:t>)</w:t>
+      </w:r>
+    </w:p>
+    <w:p>
+      <w:pPr>
+        <w:spacing w:after="0"/>
+        <w:rPr>
+          <w:color w:val="EE0000"/>
+        </w:rPr>
+      </w:pPr>
+      <w:r>
+        <w:rPr>
+          <w:color w:val="EE0000"/>
+        </w:rPr>
+        <w:t xml:space="preserve">        </w:t>
+      </w:r>
+      <w:proofErr w:type="spellStart"/>
+      <w:r>
+        <w:rPr>
+          <w:color w:val="EE0000"/>
+        </w:rPr>
+        <w:t>while</w:t>
+      </w:r>
+      <w:proofErr w:type="spellEnd"/>
+      <w:r>
+        <w:rPr>
+          <w:color w:val="EE0000"/>
+        </w:rPr>
+        <w:t xml:space="preserve"> </w:t>
+      </w:r>
+      <w:proofErr w:type="spellStart"/>
+      <w:proofErr w:type="gramStart"/>
+      <w:r>
+        <w:rPr>
+          <w:color w:val="EE0000"/>
+        </w:rPr>
+        <w:t>current.next</w:t>
+      </w:r>
+      <w:proofErr w:type="spellEnd"/>
+      <w:proofErr w:type="gramEnd"/>
+      <w:r>
+        <w:rPr>
+          <w:color w:val="EE0000"/>
+        </w:rPr>
+        <w:t>:</w:t>
+      </w:r>
+    </w:p>
+    <w:p>
+      <w:pPr>
+        <w:spacing w:after="0"/>
+        <w:rPr>
+          <w:color w:val="EE0000"/>
+        </w:rPr>
+      </w:pPr>
+      <w:r>
+        <w:rPr>
+          <w:color w:val="EE0000"/>
+        </w:rPr>
+        <w:t xml:space="preserve">            </w:t>
+      </w:r>
+      <w:proofErr w:type="spellStart"/>
+      <w:r>
+        <w:rPr>
+          <w:color w:val="EE0000"/>
+        </w:rPr>
+        <w:t>if</w:t>
+      </w:r>
+      <w:proofErr w:type="spellEnd"/>
+      <w:r>
+        <w:rPr>
+          <w:color w:val="EE0000"/>
+        </w:rPr>
+        <w:t xml:space="preserve"> </w:t>
+      </w:r>
+      <w:proofErr w:type="spellStart"/>
+      <w:proofErr w:type="gramStart"/>
+      <w:r>
+        <w:rPr>
+          <w:color w:val="EE0000"/>
+        </w:rPr>
+        <w:t>current.next</w:t>
+      </w:r>
+      <w:proofErr w:type="gramEnd"/>
+      <w:r>
+        <w:rPr>
+          <w:color w:val="EE0000"/>
+        </w:rPr>
+        <w:t>.data</w:t>
+      </w:r>
+      <w:proofErr w:type="spellEnd"/>
+      <w:r>
+        <w:rPr>
+          <w:color w:val="EE0000"/>
+        </w:rPr>
+        <w:t xml:space="preserve"> in </w:t>
+      </w:r>
+      <w:proofErr w:type="spellStart"/>
+      <w:r>
+        <w:rPr>
+          <w:color w:val="EE0000"/>
+        </w:rPr>
+        <w:t>seen</w:t>
+      </w:r>
+      <w:proofErr w:type="spellEnd"/>
+      <w:r>
+        <w:rPr>
+          <w:color w:val="EE0000"/>
+        </w:rPr>
+        <w:t>:</w:t>
+      </w:r>
+    </w:p>
+    <w:p>
+      <w:pPr>
+        <w:spacing w:after="0"/>
+        <w:rPr>
+          <w:color w:val="EE0000"/>
+        </w:rPr>
+      </w:pPr>
+      <w:r>
+        <w:rPr>
+          <w:color w:val="EE0000"/>
+        </w:rPr>
+        <w:t>                # Pula o nó duplicado</w:t>
+      </w:r>
+    </w:p>
+    <w:p>
+      <w:pPr>
+        <w:spacing w:after="0"/>
+        <w:rPr>
+          <w:color w:val="EE0000"/>
+        </w:rPr>
+      </w:pPr>
+      <w:r>
+        <w:rPr>
+          <w:color w:val="EE0000"/>
+        </w:rPr>
+        <w:t xml:space="preserve">                </w:t>
+      </w:r>
+      <w:proofErr w:type="spellStart"/>
+      <w:proofErr w:type="gramStart"/>
+      <w:r>
+        <w:rPr>
+          <w:color w:val="EE0000"/>
+        </w:rPr>
+        <w:t>current.next</w:t>
+      </w:r>
+      <w:proofErr w:type="spellEnd"/>
+      <w:proofErr w:type="gramEnd"/>
+      <w:r>
+        <w:rPr>
+          <w:color w:val="EE0000"/>
+        </w:rPr>
+        <w:t xml:space="preserve"> = </w:t>
+      </w:r>
+      <w:proofErr w:type="spellStart"/>
+      <w:proofErr w:type="gramStart"/>
+      <w:r>
+        <w:rPr>
+          <w:color w:val="EE0000"/>
+        </w:rPr>
+        <w:t>current.next</w:t>
+      </w:r>
+      <w:proofErr w:type="gramEnd"/>
+      <w:r>
+        <w:rPr>
+          <w:color w:val="EE0000"/>
+        </w:rPr>
+        <w:t>.next</w:t>
+      </w:r>
+      <w:proofErr w:type="spellEnd"/>
+    </w:p>
+    <w:p>
+      <w:pPr>
+        <w:spacing w:after="0"/>
+        <w:rPr>
+          <w:color w:val="EE0000"/>
+        </w:rPr>
+      </w:pPr>
+      <w:r>
+        <w:rPr>
+          <w:color w:val="EE0000"/>
+        </w:rPr>
+        <w:t xml:space="preserve">            </w:t>
+      </w:r>
+      <w:proofErr w:type="spellStart"/>
+      <w:r>
+        <w:rPr>
+          <w:color w:val="EE0000"/>
+        </w:rPr>
+        <w:t>else</w:t>
+      </w:r>
+      <w:proofErr w:type="spellEnd"/>
+      <w:r>
+        <w:rPr>
+          <w:color w:val="EE0000"/>
+        </w:rPr>
+        <w:t>:</w:t>
+      </w:r>
+    </w:p>
+    <w:p>
+      <w:pPr>
+        <w:spacing w:after="0"/>
+        <w:rPr>
+          <w:color w:val="EE0000"/>
+        </w:rPr>
+      </w:pPr>
+      <w:r>
+        <w:rPr>
+          <w:color w:val="EE0000"/>
+        </w:rPr>
+        <w:t xml:space="preserve">                </w:t>
+      </w:r>
+      <w:proofErr w:type="spellStart"/>
+      <w:r>
+        <w:rPr>
+          <w:color w:val="EE0000"/>
+        </w:rPr>
+        <w:t>seen.add</w:t>
+      </w:r>
+      <w:proofErr w:type="spellEnd"/>
+      <w:r>
+        <w:rPr>
+          <w:color w:val="EE0000"/>
+        </w:rPr>
+        <w:t>(</w:t>
+      </w:r>
+      <w:proofErr w:type="spellStart"/>
+      <w:proofErr w:type="gramStart"/>
+      <w:r>
+        <w:rPr>
+          <w:color w:val="EE0000"/>
+        </w:rPr>
+        <w:t>current.next</w:t>
+      </w:r>
+      <w:proofErr w:type="gramEnd"/>
+      <w:r>
+        <w:rPr>
+          <w:color w:val="EE0000"/>
+        </w:rPr>
+        <w:t>.data</w:t>
+      </w:r>
+      <w:proofErr w:type="spellEnd"/>
+      <w:r>
+        <w:rPr>
+          <w:color w:val="EE0000"/>
+        </w:rPr>
+        <w:t>)</w:t>
+      </w:r>
+    </w:p>
+    <w:p>
+      <w:pPr>
+        <w:spacing w:after="0"/>
+        <w:rPr>
+          <w:color w:val="EE0000"/>
+        </w:rPr>
+      </w:pPr>
+      <w:r>
+        <w:rPr>
+          <w:color w:val="EE0000"/>
+        </w:rPr>
+        <w:t xml:space="preserve">                </w:t>
+      </w:r>
+      <w:proofErr w:type="spellStart"/>
+      <w:r>
+        <w:rPr>
+          <w:color w:val="EE0000"/>
+        </w:rPr>
+        <w:t>current</w:t>
+      </w:r>
+      <w:proofErr w:type="spellEnd"/>
+      <w:r>
+        <w:rPr>
+          <w:color w:val="EE0000"/>
+        </w:rPr>
+        <w:t xml:space="preserve"> = </w:t>
+      </w:r>
+      <w:proofErr w:type="spellStart"/>
+      <w:proofErr w:type="gramStart"/>
+      <w:r>
+        <w:rPr>
+          <w:color w:val="EE0000"/>
+        </w:rPr>
+        <w:t>current.next</w:t>
+      </w:r>
+      <w:proofErr w:type="spellEnd"/>
+      <w:proofErr w:type="gramEnd"/>
+    </w:p>
+    <w:p>
+      <w:pPr>
+        <w:spacing w:after="0"/>
+        <w:rPr>
+          <w:color w:val="EE0000"/>
+        </w:rPr>
+      </w:pPr>
+    </w:p>
+    <w:p>
+      <w:pPr>
+        <w:spacing w:after="0"/>
+        <w:rPr>
+          <w:color w:val="EE0000"/>
+        </w:rPr>
+      </w:pPr>
+      <w:r>
+        <w:rPr>
+          <w:color w:val="EE0000"/>
+        </w:rPr>
+        <w:t># Teste</w:t>
+      </w:r>
+    </w:p>
+    <w:p>
+      <w:pPr>
+        <w:spacing w:after="0"/>
+        <w:rPr>
+          <w:color w:val="EE0000"/>
+        </w:rPr>
+      </w:pPr>
+      <w:proofErr w:type="spellStart"/>
+      <w:r>
+        <w:rPr>
+          <w:color w:val="EE0000"/>
+        </w:rPr>
+        <w:t>if</w:t>
+      </w:r>
+      <w:proofErr w:type="spellEnd"/>
+      <w:r>
+        <w:rPr>
+          <w:color w:val="EE0000"/>
+        </w:rPr>
+        <w:t xml:space="preserve"> __</w:t>
+      </w:r>
+      <w:proofErr w:type="spellStart"/>
+      <w:r>
+        <w:rPr>
+          <w:color w:val="EE0000"/>
+        </w:rPr>
+        <w:t>name</w:t>
+      </w:r>
+      <w:proofErr w:type="spellEnd"/>
+      <w:r>
+        <w:rPr>
+          <w:color w:val="EE0000"/>
+        </w:rPr>
+        <w:t>__ == "__</w:t>
+      </w:r>
+      <w:proofErr w:type="spellStart"/>
+      <w:r>
+        <w:rPr>
+          <w:color w:val="EE0000"/>
+        </w:rPr>
+        <w:t>main</w:t>
+      </w:r>
+      <w:proofErr w:type="spellEnd"/>
+      <w:r>
+        <w:rPr>
+          <w:color w:val="EE0000"/>
+        </w:rPr>
+        <w:t>__":</w:t>
+      </w:r>
+    </w:p>
+    <w:p>
+      <w:pPr>
+        <w:spacing w:after="0"/>
+        <w:rPr>
+          <w:color w:val="EE0000"/>
+        </w:rPr>
+      </w:pPr>
+      <w:r>
+        <w:rPr>
+          <w:color w:val="EE0000"/>
+        </w:rPr>
+        <w:t xml:space="preserve">    lista = </w:t>
+      </w:r>
+      <w:proofErr w:type="spellStart"/>
+      <w:proofErr w:type="gramStart"/>
+      <w:r>
+        <w:rPr>
+          <w:color w:val="EE0000"/>
+        </w:rPr>
+        <w:t>LinkedList</w:t>
+      </w:r>
+      <w:proofErr w:type="spellEnd"/>
+      <w:r>
+        <w:rPr>
+          <w:color w:val="EE0000"/>
+        </w:rPr>
+        <w:t>(</w:t>
+      </w:r>
+      <w:proofErr w:type="gramEnd"/>
+      <w:r>
+        <w:rPr>
+          <w:color w:val="EE0000"/>
+        </w:rPr>
+        <w:t>)</w:t>
+      </w:r>
+    </w:p>
+    <w:p>
+      <w:pPr>
+        <w:spacing w:after="0"/>
+        <w:rPr>
+          <w:color w:val="EE0000"/>
+        </w:rPr>
+      </w:pPr>
+      <w:r>
+        <w:rPr>
+          <w:color w:val="EE0000"/>
+        </w:rPr>
+        <w:t xml:space="preserve">    </w:t>
+      </w:r>
+      <w:proofErr w:type="spellStart"/>
+      <w:proofErr w:type="gramStart"/>
+      <w:r>
+        <w:rPr>
+          <w:color w:val="EE0000"/>
+        </w:rPr>
+        <w:t>lista.append</w:t>
+      </w:r>
+      <w:proofErr w:type="spellEnd"/>
+      <w:proofErr w:type="gramEnd"/>
+      <w:r>
+        <w:rPr>
+          <w:color w:val="EE0000"/>
+        </w:rPr>
+        <w:t>(1)</w:t>
+      </w:r>
+    </w:p>
+    <w:p>
+      <w:pPr>
+        <w:spacing w:after="0"/>
+        <w:rPr>
+          <w:color w:val="EE0000"/>
+        </w:rPr>
+      </w:pPr>
+      <w:r>
+        <w:rPr>
+          <w:color w:val="EE0000"/>
+        </w:rPr>
+        <w:t xml:space="preserve">    </w:t>
+      </w:r>
+      <w:proofErr w:type="spellStart"/>
+      <w:proofErr w:type="gramStart"/>
+      <w:r>
+        <w:rPr>
+          <w:color w:val="EE0000"/>
+        </w:rPr>
+        <w:t>lista.append</w:t>
+      </w:r>
+      <w:proofErr w:type="spellEnd"/>
+      <w:proofErr w:type="gramEnd"/>
+      <w:r>
+        <w:rPr>
+          <w:color w:val="EE0000"/>
+        </w:rPr>
+        <w:t>(2)</w:t>
+      </w:r>
+    </w:p>
+    <w:p>
+      <w:pPr>
+        <w:spacing w:after="0"/>
+        <w:rPr>
+          <w:color w:val="EE0000"/>
+        </w:rPr>
+      </w:pPr>
+      <w:r>
+        <w:rPr>
+          <w:color w:val="EE0000"/>
+        </w:rPr>
+        <w:t xml:space="preserve">    </w:t>
+      </w:r>
+      <w:proofErr w:type="spellStart"/>
+      <w:proofErr w:type="gramStart"/>
+      <w:r>
+        <w:rPr>
+          <w:color w:val="EE0000"/>
+        </w:rPr>
+        <w:t>lista.append</w:t>
+      </w:r>
+      <w:proofErr w:type="spellEnd"/>
+      <w:proofErr w:type="gramEnd"/>
+      <w:r>
+        <w:rPr>
+          <w:color w:val="EE0000"/>
+        </w:rPr>
+        <w:t>(2)</w:t>
+      </w:r>
+    </w:p>
+    <w:p>
+      <w:pPr>
+        <w:spacing w:after="0"/>
+        <w:rPr>
+          <w:color w:val="EE0000"/>
+        </w:rPr>
+      </w:pPr>
+      <w:r>
+        <w:rPr>
+          <w:color w:val="EE0000"/>
+        </w:rPr>
+        <w:t xml:space="preserve">    </w:t>
+      </w:r>
+      <w:proofErr w:type="spellStart"/>
+      <w:proofErr w:type="gramStart"/>
+      <w:r>
+        <w:rPr>
+          <w:color w:val="EE0000"/>
+        </w:rPr>
+        <w:t>lista.append</w:t>
+      </w:r>
+      <w:proofErr w:type="spellEnd"/>
+      <w:proofErr w:type="gramEnd"/>
+      <w:r>
+        <w:rPr>
+          <w:color w:val="EE0000"/>
+        </w:rPr>
+        <w:t>(3)</w:t>
+      </w:r>
+    </w:p>
+    <w:p>
+      <w:pPr>
+        <w:spacing w:after="0"/>
+        <w:rPr>
+          <w:color w:val="EE0000"/>
+        </w:rPr>
+      </w:pPr>
+      <w:r>
+        <w:rPr>
+          <w:color w:val="EE0000"/>
+        </w:rPr>
+        <w:t xml:space="preserve">    </w:t>
+      </w:r>
+      <w:proofErr w:type="spellStart"/>
+      <w:proofErr w:type="gramStart"/>
+      <w:r>
+        <w:rPr>
+          <w:color w:val="EE0000"/>
+        </w:rPr>
+        <w:t>lista.append</w:t>
+      </w:r>
+      <w:proofErr w:type="spellEnd"/>
+      <w:proofErr w:type="gramEnd"/>
+      <w:r>
+        <w:rPr>
+          <w:color w:val="EE0000"/>
+        </w:rPr>
+        <w:t>(1)</w:t>
+      </w:r>
+    </w:p>
+    <w:p>
+      <w:pPr>
+        <w:spacing w:after="0"/>
+        <w:rPr>
+          <w:color w:val="EE0000"/>
+        </w:rPr>
+      </w:pPr>
+    </w:p>
+    <w:p>
+      <w:pPr>
+        <w:spacing w:after="0"/>
+        <w:rPr>
+          <w:color w:val="EE0000"/>
+        </w:rPr>
+      </w:pPr>
+      <w:r>
+        <w:rPr>
+          <w:color w:val="EE0000"/>
+        </w:rPr>
+        <w:t xml:space="preserve">    </w:t>
+      </w:r>
+      <w:proofErr w:type="gramStart"/>
+      <w:r>
+        <w:rPr>
+          <w:color w:val="EE0000"/>
+        </w:rPr>
+        <w:t>print(</w:t>
+      </w:r>
+      <w:proofErr w:type="gramEnd"/>
+      <w:r>
+        <w:rPr>
+          <w:color w:val="EE0000"/>
+        </w:rPr>
+        <w:t>"Antes de remover duplicatas:")</w:t>
+      </w:r>
+    </w:p>
+    <w:p>
+      <w:pPr>
+        <w:spacing w:after="0"/>
+        <w:rPr>
+          <w:color w:val="EE0000"/>
+        </w:rPr>
+      </w:pPr>
+      <w:r>
+        <w:rPr>
+          <w:color w:val="EE0000"/>
+        </w:rPr>
+        <w:t xml:space="preserve">    </w:t>
+      </w:r>
+      <w:proofErr w:type="spellStart"/>
+      <w:r>
+        <w:rPr>
+          <w:color w:val="EE0000"/>
+        </w:rPr>
+        <w:t>lista.print_</w:t>
+      </w:r>
+      <w:proofErr w:type="gramStart"/>
+      <w:r>
+        <w:rPr>
+          <w:color w:val="EE0000"/>
+        </w:rPr>
+        <w:t>list</w:t>
+      </w:r>
+      <w:proofErr w:type="spellEnd"/>
+      <w:r>
+        <w:rPr>
+          <w:color w:val="EE0000"/>
+        </w:rPr>
+        <w:t>(</w:t>
+      </w:r>
+      <w:proofErr w:type="gramEnd"/>
+      <w:r>
+        <w:rPr>
+          <w:color w:val="EE0000"/>
+        </w:rPr>
+        <w:t>)</w:t>
+      </w:r>
+    </w:p>
+    <w:p>
+      <w:pPr>
+        <w:spacing w:after="0"/>
+        <w:rPr>
+          <w:color w:val="EE0000"/>
+        </w:rPr>
+      </w:pPr>
+    </w:p>
+    <w:p>
+      <w:pPr>
+        <w:spacing w:after="0"/>
+        <w:rPr>
+          <w:color w:val="EE0000"/>
+        </w:rPr>
+      </w:pPr>
+      <w:r>
+        <w:rPr>
+          <w:color w:val="EE0000"/>
+        </w:rPr>
+        <w:t xml:space="preserve">    </w:t>
+      </w:r>
+      <w:proofErr w:type="spellStart"/>
+      <w:proofErr w:type="gramStart"/>
+      <w:r>
+        <w:rPr>
+          <w:color w:val="EE0000"/>
+        </w:rPr>
+        <w:t>lista.remove</w:t>
+      </w:r>
+      <w:proofErr w:type="gramEnd"/>
+      <w:r>
+        <w:rPr>
+          <w:color w:val="EE0000"/>
+        </w:rPr>
+        <w:t>_</w:t>
+      </w:r>
+      <w:proofErr w:type="gramStart"/>
+      <w:r>
+        <w:rPr>
+          <w:color w:val="EE0000"/>
+        </w:rPr>
+        <w:t>duplicates</w:t>
+      </w:r>
+      <w:proofErr w:type="spellEnd"/>
+      <w:r>
+        <w:rPr>
+          <w:color w:val="EE0000"/>
+        </w:rPr>
+        <w:t>(</w:t>
+      </w:r>
+      <w:proofErr w:type="gramEnd"/>
+      <w:r>
+        <w:rPr>
+          <w:color w:val="EE0000"/>
+        </w:rPr>
+        <w:t>)</w:t>
+      </w:r>
+    </w:p>
+    <w:p>
+      <w:pPr>
+        <w:spacing w:after="0"/>
+        <w:rPr>
+          <w:color w:val="EE0000"/>
+        </w:rPr>
+      </w:pPr>
+    </w:p>
+    <w:p>
+      <w:pPr>
+        <w:spacing w:after="0"/>
+        <w:rPr>
+          <w:color w:val="EE0000"/>
+        </w:rPr>
+      </w:pPr>
+      <w:r>
+        <w:rPr>
+          <w:color w:val="EE0000"/>
+        </w:rPr>
+        <w:t xml:space="preserve">    </w:t>
+      </w:r>
+      <w:proofErr w:type="gramStart"/>
+      <w:r>
+        <w:rPr>
+          <w:color w:val="EE0000"/>
+        </w:rPr>
+        <w:t>print(</w:t>
+      </w:r>
+      <w:proofErr w:type="gramEnd"/>
+      <w:r>
+        <w:rPr>
+          <w:color w:val="EE0000"/>
+        </w:rPr>
+        <w:t>"Depois de remover duplicatas:")</w:t>
+      </w:r>
+    </w:p>
+    <w:p>
+      <w:pPr>
+        <w:spacing w:after="0"/>
+        <w:rPr>
+          <w:color w:val="EE0000"/>
+        </w:rPr>
+      </w:pPr>
+      <w:r>
+        <w:rPr>
+          <w:color w:val="EE0000"/>
+        </w:rPr>
+        <w:t xml:space="preserve">    </w:t>
+      </w:r>
+      <w:proofErr w:type="spellStart"/>
+      <w:r>
+        <w:rPr>
+          <w:color w:val="EE0000"/>
+        </w:rPr>
+        <w:t>lista.print_</w:t>
+      </w:r>
+      <w:proofErr w:type="gramStart"/>
+      <w:r>
+        <w:rPr>
+          <w:color w:val="EE0000"/>
+        </w:rPr>
+        <w:t>list</w:t>
+      </w:r>
+      <w:proofErr w:type="spellEnd"/>
+      <w:r>
+        <w:rPr>
+          <w:color w:val="EE0000"/>
+        </w:rPr>
+        <w:t>(</w:t>
+      </w:r>
+      <w:proofErr w:type="gramEnd"/>
+      <w:r>
+        <w:rPr>
+          <w:color w:val="EE0000"/>
+        </w:rPr>
+        <w:t>)</w:t>
+      </w:r>
+    </w:p>
+    <w:p>
+      <w:pPr>
+        <w:spacing w:after="0"/>
+        <w:rPr>
+          <w:color w:val="EE0000"/>
+        </w:rPr>
+      </w:pPr>
+    </w:p>
+    <w:p>
+      <w:pPr>
+        <w:spacing w:after="0"/>
+        <w:rPr>
+          <w:color w:val="EE0000"/>
+        </w:rPr>
+      </w:pPr>
+    </w:p>
+    <w:p>
+      <w:pPr>
+        <w:spacing w:after="0"/>
+        <w:rPr>
+          <w:color w:val="EE0000"/>
+        </w:rPr>
+      </w:pPr>
+    </w:p>
+    <w:p>
+      <w:pPr>
+        <w:spacing w:after="0"/>
+        <w:jc w:val="center"/>
+        <w:rPr>
+          <w:b/>
+          <w:bCs/>
+          <w:sz w:val="40"/>
+          <w:szCs w:val="40"/>
+        </w:rPr>
+      </w:pPr>
+      <w:r>
+        <w:rPr>
+          <w:b/>
+          <w:bCs/>
+          <w:sz w:val="40"/>
+          <w:szCs w:val="40"/>
+        </w:rPr>
+        <w:t>Pilhas</w:t>
+      </w:r>
+    </w:p>
+    <w:p>
+      <w:pPr>
+        <w:spacing w:after="0"/>
+        <w:jc w:val="center"/>
+        <w:rPr>
+          <w:b/>
+          <w:bCs/>
+          <w:sz w:val="40"/>
+          <w:szCs w:val="40"/>
+        </w:rPr>
+      </w:pPr>
+    </w:p>
+    <w:p>
+      <w:pPr>
+        <w:spacing w:after="0"/>
+        <w:rPr>
+          <w:b/>
+          <w:bCs/>
+          <w:sz w:val="40"/>
+          <w:szCs w:val="40"/>
         </w:rPr>
       </w:pPr>
     </w:p>
@@ -2268,6 +6233,119 @@
 <file path=word/numbering.xml><?xml version="1.0" encoding="utf-8"?>
 <w:numbering xmlns:wpc="http://schemas.microsoft.com/office/word/2010/wordprocessingCanvas" xmlns:cx="http://schemas.microsoft.com/office/drawing/2014/chartex" xmlns:cx1="http://schemas.microsoft.com/office/drawing/2015/9/8/chartex" xmlns:cx2="http://schemas.microsoft.com/office/drawing/2015/10/21/chartex" xmlns:cx3="http://schemas.microsoft.com/office/drawing/2016/5/9/chartex" xmlns:cx4="http://schemas.microsoft.com/office/drawing/2016/5/10/chartex" xmlns:cx5="http://schemas.microsoft.com/office/drawing/2016/5/11/chartex" xmlns:cx6="http://schemas.microsoft.com/office/drawing/2016/5/12/chartex" xmlns:cx7="http://schemas.microsoft.com/office/drawing/2016/5/13/chartex" xmlns:cx8="http://schemas.microsoft.com/office/drawing/2016/5/14/chartex" xmlns:mc="http://schemas.openxmlformats.org/markup-compatibility/2006" xmlns:aink="http://schemas.microsoft.com/office/drawing/2016/ink" xmlns:am3d="http://schemas.microsoft.com/office/drawing/2017/model3d" xmlns:o="urn:schemas-microsoft-com:office:office" xmlns:oel="http://schemas.microsoft.com/office/2019/extlst" xmlns:r="http://schemas.openxmlformats.org/officeDocument/2006/relationships" xmlns:m="http://schemas.openxmlformats.org/officeDocument/2006/math" xmlns:v="urn:schemas-microsoft-com:vml" xmlns:wp14="http://schemas.microsoft.com/office/word/2010/wordprocessingDrawing" xmlns:wp="http://schemas.openxmlformats.org/drawingml/2006/wordprocessingDrawing" xmlns:w10="urn:schemas-microsoft-com:office:word" xmlns:w="http://schemas.openxmlformats.org/wordprocessingml/2006/main" xmlns:w14="http://schemas.microsoft.com/office/word/2010/wordml" xmlns:w15="http://schemas.microsoft.com/office/word/2012/wordml" xmlns:w16cex="http://schemas.microsoft.com/office/word/2018/wordml/cex" xmlns:w16cid="http://schemas.microsoft.com/office/word/2016/wordml/cid" xmlns:w16="http://schemas.microsoft.com/office/word/2018/wordml" xmlns:w16du="http://schemas.microsoft.com/office/word/2023/wordml/word16du" xmlns:w16sdtdh="http://schemas.microsoft.com/office/word/2020/wordml/sdtdatahash" xmlns:w16sdtfl="http://schemas.microsoft.com/office/word/2024/wordml/sdtformatlock" xmlns:w16se="http://schemas.microsoft.com/office/word/2015/wordml/symex" xmlns:wpg="http://schemas.microsoft.com/office/word/2010/wordprocessingGroup" xmlns:wpi="http://schemas.microsoft.com/office/word/2010/wordprocessingInk" xmlns:wne="http://schemas.microsoft.com/office/word/2006/wordml" xmlns:wps="http://schemas.microsoft.com/office/word/2010/wordprocessingShape" mc:Ignorable="w14 w15 w16se w16cid w16 w16cex w16sdtdh w16sdtfl w16du wp14">
   <w:abstractNum w:abstractNumId="0" w15:restartNumberingAfterBreak="0">
+    <w:nsid w:val="00403B12"/>
+    <w:multiLevelType w:val="multilevel"/>
+    <w:tmpl w:val="C632FA2A"/>
+    <w:lvl w:ilvl="0">
+      <w:start w:val="1"/>
+      <w:numFmt w:val="decimal"/>
+      <w:lvlText w:val="%1."/>
+      <w:lvlJc w:val="left"/>
+      <w:pPr>
+        <w:tabs>
+          <w:tab w:val="num" w:pos="720"/>
+        </w:tabs>
+        <w:ind w:left="720" w:hanging="360"/>
+      </w:pPr>
+    </w:lvl>
+    <w:lvl w:ilvl="1" w:tentative="1">
+      <w:start w:val="1"/>
+      <w:numFmt w:val="decimal"/>
+      <w:lvlText w:val="%2."/>
+      <w:lvlJc w:val="left"/>
+      <w:pPr>
+        <w:tabs>
+          <w:tab w:val="num" w:pos="1440"/>
+        </w:tabs>
+        <w:ind w:left="1440" w:hanging="360"/>
+      </w:pPr>
+    </w:lvl>
+    <w:lvl w:ilvl="2" w:tentative="1">
+      <w:start w:val="1"/>
+      <w:numFmt w:val="decimal"/>
+      <w:lvlText w:val="%3."/>
+      <w:lvlJc w:val="left"/>
+      <w:pPr>
+        <w:tabs>
+          <w:tab w:val="num" w:pos="2160"/>
+        </w:tabs>
+        <w:ind w:left="2160" w:hanging="360"/>
+      </w:pPr>
+    </w:lvl>
+    <w:lvl w:ilvl="3" w:tentative="1">
+      <w:start w:val="1"/>
+      <w:numFmt w:val="decimal"/>
+      <w:lvlText w:val="%4."/>
+      <w:lvlJc w:val="left"/>
+      <w:pPr>
+        <w:tabs>
+          <w:tab w:val="num" w:pos="2880"/>
+        </w:tabs>
+        <w:ind w:left="2880" w:hanging="360"/>
+      </w:pPr>
+    </w:lvl>
+    <w:lvl w:ilvl="4" w:tentative="1">
+      <w:start w:val="1"/>
+      <w:numFmt w:val="decimal"/>
+      <w:lvlText w:val="%5."/>
+      <w:lvlJc w:val="left"/>
+      <w:pPr>
+        <w:tabs>
+          <w:tab w:val="num" w:pos="3600"/>
+        </w:tabs>
+        <w:ind w:left="3600" w:hanging="360"/>
+      </w:pPr>
+    </w:lvl>
+    <w:lvl w:ilvl="5" w:tentative="1">
+      <w:start w:val="1"/>
+      <w:numFmt w:val="decimal"/>
+      <w:lvlText w:val="%6."/>
+      <w:lvlJc w:val="left"/>
+      <w:pPr>
+        <w:tabs>
+          <w:tab w:val="num" w:pos="4320"/>
+        </w:tabs>
+        <w:ind w:left="4320" w:hanging="360"/>
+      </w:pPr>
+    </w:lvl>
+    <w:lvl w:ilvl="6" w:tentative="1">
+      <w:start w:val="1"/>
+      <w:numFmt w:val="decimal"/>
+      <w:lvlText w:val="%7."/>
+      <w:lvlJc w:val="left"/>
+      <w:pPr>
+        <w:tabs>
+          <w:tab w:val="num" w:pos="5040"/>
+        </w:tabs>
+        <w:ind w:left="5040" w:hanging="360"/>
+      </w:pPr>
+    </w:lvl>
+    <w:lvl w:ilvl="7" w:tentative="1">
+      <w:start w:val="1"/>
+      <w:numFmt w:val="decimal"/>
+      <w:lvlText w:val="%8."/>
+      <w:lvlJc w:val="left"/>
+      <w:pPr>
+        <w:tabs>
+          <w:tab w:val="num" w:pos="5760"/>
+        </w:tabs>
+        <w:ind w:left="5760" w:hanging="360"/>
+      </w:pPr>
+    </w:lvl>
+    <w:lvl w:ilvl="8" w:tentative="1">
+      <w:start w:val="1"/>
+      <w:numFmt w:val="decimal"/>
+      <w:lvlText w:val="%9."/>
+      <w:lvlJc w:val="left"/>
+      <w:pPr>
+        <w:tabs>
+          <w:tab w:val="num" w:pos="6480"/>
+        </w:tabs>
+        <w:ind w:left="6480" w:hanging="360"/>
+      </w:pPr>
+    </w:lvl>
+  </w:abstractNum>
+  <w:abstractNum w:abstractNumId="1" w15:restartNumberingAfterBreak="0">
     <w:nsid w:val="088179D3"/>
     <w:multiLevelType w:val="hybridMultilevel"/>
     <w:tmpl w:val="7FA42462"/>
@@ -2356,7 +6434,7 @@
       </w:pPr>
     </w:lvl>
   </w:abstractNum>
-  <w:abstractNum w:abstractNumId="1" w15:restartNumberingAfterBreak="0">
+  <w:abstractNum w:abstractNumId="2" w15:restartNumberingAfterBreak="0">
     <w:nsid w:val="22C92CB0"/>
     <w:multiLevelType w:val="multilevel"/>
     <w:tmpl w:val="4DDEB596"/>
@@ -2505,7 +6583,7 @@
       </w:rPr>
     </w:lvl>
   </w:abstractNum>
-  <w:abstractNum w:abstractNumId="2" w15:restartNumberingAfterBreak="0">
+  <w:abstractNum w:abstractNumId="3" w15:restartNumberingAfterBreak="0">
     <w:nsid w:val="2A3F73DD"/>
     <w:multiLevelType w:val="multilevel"/>
     <w:tmpl w:val="59021FB8"/>
@@ -2654,7 +6732,7 @@
       </w:rPr>
     </w:lvl>
   </w:abstractNum>
-  <w:abstractNum w:abstractNumId="3" w15:restartNumberingAfterBreak="0">
+  <w:abstractNum w:abstractNumId="4" w15:restartNumberingAfterBreak="0">
     <w:nsid w:val="665233E7"/>
     <w:multiLevelType w:val="multilevel"/>
     <w:tmpl w:val="A1886560"/>
@@ -2771,7 +6849,120 @@
       </w:pPr>
     </w:lvl>
   </w:abstractNum>
-  <w:abstractNum w:abstractNumId="4" w15:restartNumberingAfterBreak="0">
+  <w:abstractNum w:abstractNumId="5" w15:restartNumberingAfterBreak="0">
+    <w:nsid w:val="73210C98"/>
+    <w:multiLevelType w:val="multilevel"/>
+    <w:tmpl w:val="B7E6AA7A"/>
+    <w:lvl w:ilvl="0">
+      <w:start w:val="1"/>
+      <w:numFmt w:val="decimal"/>
+      <w:lvlText w:val="%1."/>
+      <w:lvlJc w:val="left"/>
+      <w:pPr>
+        <w:tabs>
+          <w:tab w:val="num" w:pos="720"/>
+        </w:tabs>
+        <w:ind w:left="720" w:hanging="360"/>
+      </w:pPr>
+    </w:lvl>
+    <w:lvl w:ilvl="1" w:tentative="1">
+      <w:start w:val="1"/>
+      <w:numFmt w:val="decimal"/>
+      <w:lvlText w:val="%2."/>
+      <w:lvlJc w:val="left"/>
+      <w:pPr>
+        <w:tabs>
+          <w:tab w:val="num" w:pos="1440"/>
+        </w:tabs>
+        <w:ind w:left="1440" w:hanging="360"/>
+      </w:pPr>
+    </w:lvl>
+    <w:lvl w:ilvl="2" w:tentative="1">
+      <w:start w:val="1"/>
+      <w:numFmt w:val="decimal"/>
+      <w:lvlText w:val="%3."/>
+      <w:lvlJc w:val="left"/>
+      <w:pPr>
+        <w:tabs>
+          <w:tab w:val="num" w:pos="2160"/>
+        </w:tabs>
+        <w:ind w:left="2160" w:hanging="360"/>
+      </w:pPr>
+    </w:lvl>
+    <w:lvl w:ilvl="3" w:tentative="1">
+      <w:start w:val="1"/>
+      <w:numFmt w:val="decimal"/>
+      <w:lvlText w:val="%4."/>
+      <w:lvlJc w:val="left"/>
+      <w:pPr>
+        <w:tabs>
+          <w:tab w:val="num" w:pos="2880"/>
+        </w:tabs>
+        <w:ind w:left="2880" w:hanging="360"/>
+      </w:pPr>
+    </w:lvl>
+    <w:lvl w:ilvl="4" w:tentative="1">
+      <w:start w:val="1"/>
+      <w:numFmt w:val="decimal"/>
+      <w:lvlText w:val="%5."/>
+      <w:lvlJc w:val="left"/>
+      <w:pPr>
+        <w:tabs>
+          <w:tab w:val="num" w:pos="3600"/>
+        </w:tabs>
+        <w:ind w:left="3600" w:hanging="360"/>
+      </w:pPr>
+    </w:lvl>
+    <w:lvl w:ilvl="5" w:tentative="1">
+      <w:start w:val="1"/>
+      <w:numFmt w:val="decimal"/>
+      <w:lvlText w:val="%6."/>
+      <w:lvlJc w:val="left"/>
+      <w:pPr>
+        <w:tabs>
+          <w:tab w:val="num" w:pos="4320"/>
+        </w:tabs>
+        <w:ind w:left="4320" w:hanging="360"/>
+      </w:pPr>
+    </w:lvl>
+    <w:lvl w:ilvl="6" w:tentative="1">
+      <w:start w:val="1"/>
+      <w:numFmt w:val="decimal"/>
+      <w:lvlText w:val="%7."/>
+      <w:lvlJc w:val="left"/>
+      <w:pPr>
+        <w:tabs>
+          <w:tab w:val="num" w:pos="5040"/>
+        </w:tabs>
+        <w:ind w:left="5040" w:hanging="360"/>
+      </w:pPr>
+    </w:lvl>
+    <w:lvl w:ilvl="7" w:tentative="1">
+      <w:start w:val="1"/>
+      <w:numFmt w:val="decimal"/>
+      <w:lvlText w:val="%8."/>
+      <w:lvlJc w:val="left"/>
+      <w:pPr>
+        <w:tabs>
+          <w:tab w:val="num" w:pos="5760"/>
+        </w:tabs>
+        <w:ind w:left="5760" w:hanging="360"/>
+      </w:pPr>
+    </w:lvl>
+    <w:lvl w:ilvl="8" w:tentative="1">
+      <w:start w:val="1"/>
+      <w:numFmt w:val="decimal"/>
+      <w:lvlText w:val="%9."/>
+      <w:lvlJc w:val="left"/>
+      <w:pPr>
+        <w:tabs>
+          <w:tab w:val="num" w:pos="6480"/>
+        </w:tabs>
+        <w:ind w:left="6480" w:hanging="360"/>
+      </w:pPr>
+    </w:lvl>
+  </w:abstractNum>
+  <w:abstractNum w:abstractNumId="6" w15:restartNumberingAfterBreak="0">
     <w:nsid w:val="7FB81515"/>
     <w:multiLevelType w:val="multilevel"/>
     <w:tmpl w:val="0F546098"/>
@@ -2921,19 +7112,25 @@
     </w:lvl>
   </w:abstractNum>
   <w:num w:numId="1" w16cid:durableId="114717271">
+    <w:abstractNumId w:val="1"/>
+  </w:num>
+  <w:num w:numId="2" w16cid:durableId="540898687">
+    <w:abstractNumId w:val="6"/>
+  </w:num>
+  <w:num w:numId="3" w16cid:durableId="609975736">
+    <w:abstractNumId w:val="3"/>
+  </w:num>
+  <w:num w:numId="4" w16cid:durableId="1606230413">
+    <w:abstractNumId w:val="2"/>
+  </w:num>
+  <w:num w:numId="5" w16cid:durableId="951208165">
+    <w:abstractNumId w:val="4"/>
+  </w:num>
+  <w:num w:numId="6" w16cid:durableId="1394161866">
     <w:abstractNumId w:val="0"/>
   </w:num>
-  <w:num w:numId="2" w16cid:durableId="540898687">
-    <w:abstractNumId w:val="4"/>
-  </w:num>
-  <w:num w:numId="3" w16cid:durableId="609975736">
-    <w:abstractNumId w:val="2"/>
-  </w:num>
-  <w:num w:numId="4" w16cid:durableId="1606230413">
-    <w:abstractNumId w:val="1"/>
-  </w:num>
-  <w:num w:numId="5" w16cid:durableId="951208165">
-    <w:abstractNumId w:val="3"/>
+  <w:num w:numId="7" w16cid:durableId="1235432448">
+    <w:abstractNumId w:val="5"/>
   </w:num>
 </w:numbering>
 </file>

</xml_diff>